<commit_message>
feat: integrate SOTA 2026 specifications (Agentic SOC, PQC, PDDL, CTEM)
</commit_message>
<xml_diff>
--- a/NetSentinel_Cahier_des_Charges.docx
+++ b/NetSentinel_Cahier_des_Charges.docx
@@ -160,6 +160,203 @@
         </w:sectPr>
       </w:pPr>
     </w:p>
+    <w:p>
+      <w:pPr>
+        <w:pStyle w:val="Heading2"/>
+      </w:pPr>
+      <w:r>
+        <w:t>Historique des Versions</w:t>
+      </w:r>
+    </w:p>
+    <w:tbl>
+      <w:tblPr>
+        <w:tblW w:type="auto" w:w="0"/>
+        <w:tblLook w:firstColumn="1" w:firstRow="1" w:lastColumn="0" w:lastRow="0" w:noHBand="0" w:noVBand="1" w:val="04A0"/>
+        <w:tblBorders>
+          <w:top w:val="single" w:sz="4" w:space="0" w:color="auto"/>
+          <w:left w:val="single" w:sz="4" w:space="0" w:color="auto"/>
+          <w:bottom w:val="single" w:sz="4" w:space="0" w:color="auto"/>
+          <w:right w:val="single" w:sz="4" w:space="0" w:color="auto"/>
+          <w:insideH w:val="single" w:sz="4" w:space="0" w:color="auto"/>
+          <w:insideV w:val="single" w:sz="4" w:space="0" w:color="auto"/>
+        </w:tblBorders>
+      </w:tblPr>
+      <w:tblGrid>
+        <w:gridCol w:w="2409"/>
+        <w:gridCol w:w="2409"/>
+        <w:gridCol w:w="2409"/>
+        <w:gridCol w:w="2409"/>
+      </w:tblGrid>
+      <w:tr>
+        <w:tc>
+          <w:tcPr>
+            <w:tcW w:type="dxa" w:w="2409"/>
+          </w:tcPr>
+          <w:p>
+            <w:r>
+              <w:t>Version</w:t>
+            </w:r>
+          </w:p>
+        </w:tc>
+        <w:tc>
+          <w:tcPr>
+            <w:tcW w:type="dxa" w:w="2409"/>
+          </w:tcPr>
+          <w:p>
+            <w:r>
+              <w:t>Date</w:t>
+            </w:r>
+          </w:p>
+        </w:tc>
+        <w:tc>
+          <w:tcPr>
+            <w:tcW w:type="dxa" w:w="2409"/>
+          </w:tcPr>
+          <w:p>
+            <w:r>
+              <w:t>Auteur</w:t>
+            </w:r>
+          </w:p>
+        </w:tc>
+        <w:tc>
+          <w:tcPr>
+            <w:tcW w:type="dxa" w:w="2409"/>
+          </w:tcPr>
+          <w:p>
+            <w:r>
+              <w:t>Description des modifications</w:t>
+            </w:r>
+          </w:p>
+        </w:tc>
+      </w:tr>
+      <w:tr>
+        <w:tc>
+          <w:tcPr>
+            <w:tcW w:type="dxa" w:w="2409"/>
+          </w:tcPr>
+          <w:p>
+            <w:r>
+              <w:t>0.1</w:t>
+            </w:r>
+          </w:p>
+        </w:tc>
+        <w:tc>
+          <w:tcPr>
+            <w:tcW w:type="dxa" w:w="2409"/>
+          </w:tcPr>
+          <w:p>
+            <w:r>
+              <w:t>15 Mai 2025</w:t>
+            </w:r>
+          </w:p>
+        </w:tc>
+        <w:tc>
+          <w:tcPr>
+            <w:tcW w:type="dxa" w:w="2409"/>
+          </w:tcPr>
+          <w:p>
+            <w:r>
+              <w:t>tonyCh</w:t>
+            </w:r>
+          </w:p>
+        </w:tc>
+        <w:tc>
+          <w:tcPr>
+            <w:tcW w:type="dxa" w:w="2409"/>
+          </w:tcPr>
+          <w:p>
+            <w:r>
+              <w:t>Version initiale (ébauche et périmètre technique)</w:t>
+            </w:r>
+          </w:p>
+        </w:tc>
+      </w:tr>
+      <w:tr>
+        <w:tc>
+          <w:tcPr>
+            <w:tcW w:type="dxa" w:w="2409"/>
+          </w:tcPr>
+          <w:p>
+            <w:r>
+              <w:t>1.0</w:t>
+            </w:r>
+          </w:p>
+        </w:tc>
+        <w:tc>
+          <w:tcPr>
+            <w:tcW w:type="dxa" w:w="2409"/>
+          </w:tcPr>
+          <w:p>
+            <w:r>
+              <w:t>Juin 2025</w:t>
+            </w:r>
+          </w:p>
+        </w:tc>
+        <w:tc>
+          <w:tcPr>
+            <w:tcW w:type="dxa" w:w="2409"/>
+          </w:tcPr>
+          <w:p>
+            <w:r>
+              <w:t>tonyCh</w:t>
+            </w:r>
+          </w:p>
+        </w:tc>
+        <w:tc>
+          <w:tcPr>
+            <w:tcW w:type="dxa" w:w="2409"/>
+          </w:tcPr>
+          <w:p>
+            <w:r>
+              <w:t>Version de base pour le lancement fonctionnel</w:t>
+            </w:r>
+          </w:p>
+        </w:tc>
+      </w:tr>
+      <w:tr>
+        <w:tc>
+          <w:tcPr>
+            <w:tcW w:type="dxa" w:w="2409"/>
+          </w:tcPr>
+          <w:p>
+            <w:r>
+              <w:t>1.1</w:t>
+            </w:r>
+          </w:p>
+        </w:tc>
+        <w:tc>
+          <w:tcPr>
+            <w:tcW w:type="dxa" w:w="2409"/>
+          </w:tcPr>
+          <w:p>
+            <w:r>
+              <w:t>Juillet 2026</w:t>
+            </w:r>
+          </w:p>
+        </w:tc>
+        <w:tc>
+          <w:tcPr>
+            <w:tcW w:type="dxa" w:w="2409"/>
+          </w:tcPr>
+          <w:p>
+            <w:r>
+              <w:t>tonyCh</w:t>
+            </w:r>
+          </w:p>
+        </w:tc>
+        <w:tc>
+          <w:tcPr>
+            <w:tcW w:type="dxa" w:w="2409"/>
+          </w:tcPr>
+          <w:p>
+            <w:r>
+              <w:t>Mise à jour complète : ajout des sections fonctionnelles, cybersécurité détaillée (PDDL), budget, UAT, SLA et gouvernance.</w:t>
+            </w:r>
+          </w:p>
+        </w:tc>
+      </w:tr>
+    </w:tbl>
+    <w:p/>
     <w:p>
       <w:pPr>
         <w:pStyle w:val="Heading1"/>
@@ -3733,15 +3930,7 @@
           </w:tcPr>
           <w:p>
             <w:r>
-              <w:rPr>
-                <w:rFonts w:ascii="Courier New" w:cs="Courier New" w:eastAsia="Courier New" w:hAnsi="Courier New"/>
-                <w:b/>
-                <w:bCs/>
-                <w:color w:val="E94560"/>
-                <w:sz w:val="20"/>
-                <w:szCs w:val="20"/>
-              </w:rPr>
-              <w:t xml:space="preserve">Anthropic Claude API</w:t>
+              <w:t>Anthropic Gemini API</w:t>
             </w:r>
           </w:p>
         </w:tc>
@@ -5260,15 +5449,7 @@
           </w:tcPr>
           <w:p>
             <w:r>
-              <w:rPr>
-                <w:rFonts w:ascii="Arial" w:cs="Arial" w:eastAsia="Arial" w:hAnsi="Arial"/>
-                <w:b/>
-                <w:bCs/>
-                <w:color w:val="0F3460"/>
-                <w:sz w:val="22"/>
-                <w:szCs w:val="22"/>
-              </w:rPr>
-              <w:t xml:space="preserve">5. Persistence</w:t>
+              <w:t>7. Persistence</w:t>
             </w:r>
           </w:p>
         </w:tc>
@@ -5325,15 +5506,7 @@
           </w:tcPr>
           <w:p>
             <w:r>
-              <w:rPr>
-                <w:rFonts w:ascii="Arial" w:cs="Arial" w:eastAsia="Arial" w:hAnsi="Arial"/>
-                <w:b/>
-                <w:bCs/>
-                <w:color w:val="0F3460"/>
-                <w:sz w:val="22"/>
-                <w:szCs w:val="22"/>
-              </w:rPr>
-              <w:t xml:space="preserve">6. AI Analysis</w:t>
+              <w:t>10. AI Analysis</w:t>
             </w:r>
           </w:p>
         </w:tc>
@@ -5356,13 +5529,7 @@
           </w:tcPr>
           <w:p>
             <w:r>
-              <w:rPr>
-                <w:rFonts w:ascii="Arial" w:cs="Arial" w:eastAsia="Arial" w:hAnsi="Arial"/>
-                <w:color w:val="1F2937"/>
-                <w:sz w:val="22"/>
-                <w:szCs w:val="22"/>
-              </w:rPr>
-              <w:t xml:space="preserve">Les données brutes sont envoyées à l'API Claude pour contextualisation</w:t>
+              <w:t>Les données brutes sont envoyées à l'API Gemini pour contextualisation</w:t>
             </w:r>
           </w:p>
         </w:tc>
@@ -5390,15 +5557,7 @@
           </w:tcPr>
           <w:p>
             <w:r>
-              <w:rPr>
-                <w:rFonts w:ascii="Arial" w:cs="Arial" w:eastAsia="Arial" w:hAnsi="Arial"/>
-                <w:b/>
-                <w:bCs/>
-                <w:color w:val="0F3460"/>
-                <w:sz w:val="22"/>
-                <w:szCs w:val="22"/>
-              </w:rPr>
-              <w:t xml:space="preserve">7. Render</w:t>
+              <w:t>13. Render</w:t>
             </w:r>
           </w:p>
         </w:tc>
@@ -5454,6 +5613,375 @@
         <w:br w:type="page"/>
       </w:r>
     </w:p>
+    <w:p>
+      <w:pPr>
+        <w:pStyle w:val="Heading1"/>
+      </w:pPr>
+      <w:r>
+        <w:t>5. Spécifications Fonctionnelles</w:t>
+      </w:r>
+    </w:p>
+    <w:p>
+      <w:r>
+        <w:t>Cette section formalise les cas d'usage transverses et la gestion des utilisateurs au sein de la plateforme NetSentinel.</w:t>
+      </w:r>
+    </w:p>
+    <w:p>
+      <w:pPr>
+        <w:pStyle w:val="Heading2"/>
+      </w:pPr>
+      <w:r>
+        <w:t>5.1 Tableau de Bord SOC (Security Operations Center)</w:t>
+      </w:r>
+    </w:p>
+    <w:p>
+      <w:r>
+        <w:t>Le tableau de bord SOC constitue l'interface centrale de NetSentinel. Il fournit une vue d'ensemble en temps réel de l'état de sécurité du réseau audité :</w:t>
+      </w:r>
+    </w:p>
+    <w:p>
+      <w:pPr>
+        <w:pStyle w:val="ListParagraph"/>
+      </w:pPr>
+      <w:r>
+        <w:t>• Visualisation en temps réel de la topologie réseau découverte (graphe interactif D3.js).</w:t>
+      </w:r>
+    </w:p>
+    <w:p>
+      <w:pPr>
+        <w:pStyle w:val="ListParagraph"/>
+      </w:pPr>
+      <w:r>
+        <w:t>• Indicateur du niveau de menace global calculé dynamiquement (Risk Score).</w:t>
+      </w:r>
+    </w:p>
+    <w:p>
+      <w:pPr>
+        <w:pStyle w:val="ListParagraph"/>
+      </w:pPr>
+      <w:r>
+        <w:t>• Flux de notifications d'incidents et d'alertes de sécurité classés par ordre de sévérité.</w:t>
+      </w:r>
+    </w:p>
+    <w:p>
+      <w:pPr>
+        <w:pStyle w:val="ListParagraph"/>
+      </w:pPr>
+      <w:r>
+        <w:t>• Raccourcis pour initier des actions rapides (isolation réseau, scan agressif, etc.).</w:t>
+      </w:r>
+    </w:p>
+    <w:p>
+      <w:pPr>
+        <w:pStyle w:val="Heading2"/>
+      </w:pPr>
+      <w:r>
+        <w:t>5.2 Workflow d'Alerte et Notification</w:t>
+      </w:r>
+    </w:p>
+    <w:p>
+      <w:r>
+        <w:t>Dès qu'une vulnérabilité critique ou un comportement suspect (ex. protocole non chiffré) est détecté :</w:t>
+      </w:r>
+    </w:p>
+    <w:p>
+      <w:pPr>
+        <w:pStyle w:val="ListParagraph"/>
+      </w:pPr>
+      <w:r>
+        <w:t>1. Détection : Le service arrière (tshark, nmap) lève un événement contenant les métadonnées de la menace.</w:t>
+      </w:r>
+    </w:p>
+    <w:p>
+      <w:pPr>
+        <w:pStyle w:val="ListParagraph"/>
+      </w:pPr>
+      <w:r>
+        <w:t>2. Notification UI : Un toast animé apparaît immédiatement à l'écran de l'opérateur.</w:t>
+      </w:r>
+    </w:p>
+    <w:p>
+      <w:pPr>
+        <w:pStyle w:val="ListParagraph"/>
+      </w:pPr>
+      <w:r>
+        <w:t>3. Diagnostic IA : Un clic sur l'alerte ouvre un drawer latéral affichant une explication générée par l'API Gemini et une suggestion de remédiation.</w:t>
+      </w:r>
+    </w:p>
+    <w:p>
+      <w:pPr>
+        <w:pStyle w:val="ListParagraph"/>
+      </w:pPr>
+      <w:r>
+        <w:t>4. Remédiation : L'opérateur peut valider d'un clic l'action recommandée (ex. exécuter le playbook de blocage).</w:t>
+      </w:r>
+    </w:p>
+    <w:p>
+      <w:pPr>
+        <w:pStyle w:val="Heading2"/>
+      </w:pPr>
+      <w:r>
+        <w:t>5.3 Rôles Utilisateurs et Habilitations</w:t>
+      </w:r>
+    </w:p>
+    <w:p>
+      <w:r>
+        <w:t>NetSentinel définit trois profils d'utilisateurs distincts pour sécuriser l'usage de la plateforme :</w:t>
+      </w:r>
+    </w:p>
+    <w:p>
+      <w:pPr>
+        <w:pStyle w:val="ListParagraph"/>
+      </w:pPr>
+      <w:r>
+        <w:t>• Administrateur (Tech Lead / Auditeur Principal) : Dispose d'un accès complet à toutes les fonctionnalités, y compris la configuration active du proxy d'interception (MitM) et l'élévation de permissions système.</w:t>
+      </w:r>
+    </w:p>
+    <w:p>
+      <w:pPr>
+        <w:pStyle w:val="ListParagraph"/>
+      </w:pPr>
+      <w:r>
+        <w:t>• Auditeur Sécurité (Junior) : Peut lancer des scans réseau, observer le trafic en temps réel et générer des rapports d'audit, mais n'a pas l'autorisation de modifier les requêtes interceptées.</w:t>
+      </w:r>
+    </w:p>
+    <w:p>
+      <w:pPr>
+        <w:pStyle w:val="ListParagraph"/>
+      </w:pPr>
+      <w:r>
+        <w:t>• Apprenant / Étudiant : Profil bridé à usage éducatif. L'assistance IA explicative est activée au maximum. Les scans sont limités aux plages de réseau local privées (RFC 1918) pour éviter tout usage offensif externe.</w:t>
+      </w:r>
+    </w:p>
+    <w:p>
+      <w:pPr>
+        <w:pStyle w:val="Heading2"/>
+      </w:pPr>
+      <w:r>
+        <w:t>5.4 Gestion des Habilitations et Privilèges</w:t>
+      </w:r>
+    </w:p>
+    <w:p>
+      <w:r>
+        <w:t>Afin de respecter le principe du moindre privilège, l'application n'est jamais exécutée dans son ensemble avec les droits root. L'élévation de privilèges est gérée de manière granulaire :</w:t>
+      </w:r>
+    </w:p>
+    <w:p>
+      <w:pPr>
+        <w:pStyle w:val="ListParagraph"/>
+      </w:pPr>
+      <w:r>
+        <w:t>• Utilisation de PolicyKit (pkexec) avec boîte de dialogue graphique pour authentifier l'opérateur avant d'assigner des privilèges réseau temporaires.</w:t>
+      </w:r>
+    </w:p>
+    <w:p>
+      <w:pPr>
+        <w:pStyle w:val="ListParagraph"/>
+      </w:pPr>
+      <w:r>
+        <w:t>• Application persistante des capabilities Linux (cap_net_raw, cap_net_admin) sur les binaires spécifiques (nmap, tshark) lors de l'installation pour éliminer le besoin de sudo en cours d'exécution.</w:t>
+      </w:r>
+    </w:p>
+    <w:p/>
+    <w:p>
+      <w:pPr>
+        <w:pStyle w:val="Heading1"/>
+      </w:pPr>
+      <w:r>
+        <w:t>6. Spécifications Non-Fonctionnelles</w:t>
+      </w:r>
+    </w:p>
+    <w:p>
+      <w:r>
+        <w:t>Cette section définit les exigences de qualité de service, de sécurité de l'information et de résilience de NetSentinel.</w:t>
+      </w:r>
+    </w:p>
+    <w:p>
+      <w:pPr>
+        <w:pStyle w:val="Heading2"/>
+      </w:pPr>
+      <w:r>
+        <w:t>6.1 Latence Maximale de l'Interface</w:t>
+      </w:r>
+    </w:p>
+    <w:p>
+      <w:pPr>
+        <w:pStyle w:val="ListParagraph"/>
+      </w:pPr>
+      <w:r>
+        <w:t>• Latence de réponse de l'IHM aux interactions utilisateur : inférieure à 100 ms.</w:t>
+      </w:r>
+    </w:p>
+    <w:p>
+      <w:pPr>
+        <w:pStyle w:val="ListParagraph"/>
+      </w:pPr>
+      <w:r>
+        <w:t>• Rafraîchissement des graphiques de trafic temps réel (Phase 3) : latence de rendu inférieure à 500 ms.</w:t>
+      </w:r>
+    </w:p>
+    <w:p>
+      <w:pPr>
+        <w:pStyle w:val="ListParagraph"/>
+      </w:pPr>
+      <w:r>
+        <w:t>• Temps de traitement des requêtes de base de données locale (SQLite) : inférieur à 200 ms.</w:t>
+      </w:r>
+    </w:p>
+    <w:p>
+      <w:pPr>
+        <w:pStyle w:val="Heading2"/>
+      </w:pPr>
+      <w:r>
+        <w:t>6.2 Disponibilité et Autonomie</w:t>
+      </w:r>
+    </w:p>
+    <w:p>
+      <w:pPr>
+        <w:pStyle w:val="ListParagraph"/>
+      </w:pPr>
+      <w:r>
+        <w:t>• NetSentinel est conçue pour fonctionner de manière autonome (100% offline) pour l'ensemble des tâches d'audit et d'analyse réseau local.</w:t>
+      </w:r>
+    </w:p>
+    <w:p>
+      <w:pPr>
+        <w:pStyle w:val="ListParagraph"/>
+      </w:pPr>
+      <w:r>
+        <w:t>• La base de données SQLite locale assure un accès instantané à l'historique des sessions et aux CVE sans nécessiter de connexion internet.</w:t>
+      </w:r>
+    </w:p>
+    <w:p>
+      <w:pPr>
+        <w:pStyle w:val="ListParagraph"/>
+      </w:pPr>
+      <w:r>
+        <w:t>• Seul le module d'assistance IA contextuelle requiert un accès HTTPS externe vers l'API Gemini (avec fallback dégradé en mode hors-ligne).</w:t>
+      </w:r>
+    </w:p>
+    <w:p>
+      <w:pPr>
+        <w:pStyle w:val="Heading2"/>
+      </w:pPr>
+      <w:r>
+        <w:t>6.3 Chiffrement et Sécurisation</w:t>
+      </w:r>
+    </w:p>
+    <w:p>
+      <w:pPr>
+        <w:pStyle w:val="ListParagraph"/>
+      </w:pPr>
+      <w:r>
+        <w:t>• Base de données SQLite chiffrée de bout en bout en AES-256 avec un mot de passe dérivé de l'identifiant de session de l'utilisateur.</w:t>
+      </w:r>
+    </w:p>
+    <w:p>
+      <w:pPr>
+        <w:pStyle w:val="ListParagraph"/>
+      </w:pPr>
+      <w:r>
+        <w:t>• Clés API d'assistance IA stockées de manière sécurisée dans le trousseau de clés du système d'exploitation hôte (via libsecret sur Ubuntu).</w:t>
+      </w:r>
+    </w:p>
+    <w:p>
+      <w:pPr>
+        <w:pStyle w:val="ListParagraph"/>
+      </w:pPr>
+      <w:r>
+        <w:t>• Flux de données réseau sensibles interceptés (Phase 4) isolés dans un répertoire temporaire chiffré en mémoire vive (tmpfs) et purgés dès la fermeture de la session.</w:t>
+      </w:r>
+    </w:p>
+    <w:p>
+      <w:pPr>
+        <w:pStyle w:val="Heading2"/>
+      </w:pPr>
+      <w:r>
+        <w:t>6.4 Volumétrie de Logs et Performance Réseau</w:t>
+      </w:r>
+    </w:p>
+    <w:p>
+      <w:pPr>
+        <w:pStyle w:val="ListParagraph"/>
+      </w:pPr>
+      <w:r>
+        <w:t>• Capacité de traitement de tshark : jusqu'à 10 000 paquets par seconde sur une interface Gigabit sans perte de paquets.</w:t>
+      </w:r>
+    </w:p>
+    <w:p>
+      <w:pPr>
+        <w:pStyle w:val="ListParagraph"/>
+      </w:pPr>
+      <w:r>
+        <w:t>• Stockage des logs : taille maximale de log par session fixée à 100 Mo avec un mécanisme de rotation circulaire automatique.</w:t>
+      </w:r>
+    </w:p>
+    <w:p>
+      <w:pPr>
+        <w:pStyle w:val="Heading2"/>
+      </w:pPr>
+      <w:r>
+        <w:t>6.5 Plan de Reprise après Sinistre (RTO / RPO)</w:t>
+      </w:r>
+    </w:p>
+    <w:p>
+      <w:pPr>
+        <w:pStyle w:val="ListParagraph"/>
+      </w:pPr>
+      <w:r>
+        <w:t>• RTO (Recovery Time Objective) : inférieur à 5 minutes pour restaurer l'application à son état opérationnel initial après un crash système.</w:t>
+      </w:r>
+    </w:p>
+    <w:p>
+      <w:pPr>
+        <w:pStyle w:val="ListParagraph"/>
+      </w:pPr>
+      <w:r>
+        <w:t>• RPO (Recovery Point Objective) : inférieur à 1 minute. Les données de scan et de capture de trafic sont sauvegardées de manière transactionnelle en base SQLite toutes les 30 secondes pour minimiser les pertes de données en cas de coupure de courant.</w:t>
+      </w:r>
+    </w:p>
+    <w:p/>
+    <w:p>
+      <w:pPr>
+        <w:pStyle w:val="Heading2"/>
+      </w:pPr>
+      <w:r>
+        <w:t>6.6 Cryptographie Post-Quantique (PQC) &amp; Crypto-Agilité</w:t>
+      </w:r>
+    </w:p>
+    <w:p>
+      <w:pPr>
+        <w:pStyle w:val="ListParagraph"/>
+      </w:pPr>
+      <w:r>
+        <w:t>• Contexte et Menace "Harvest-Now-Decrypt-Later" : Pour protéger les données à confidentialité longue durée (bancaires de la BRB, médicales et électorales) contre l'interception immédiate et le déchiffrement ultérieur par ordinateur quantique, NetSentinel intègre des mesures de protection quantique.</w:t>
+      </w:r>
+    </w:p>
+    <w:p>
+      <w:pPr>
+        <w:pStyle w:val="ListParagraph"/>
+      </w:pPr>
+      <w:r>
+        <w:t>• Principe de Crypto-Agilité : L'architecture logicielle sépare strictement la couche protocolaire de l'implémentation des algorithmes. Cela permet de basculer de TLS 1.3 standard vers des algorithmes post-quantiques (ex. ML-KEM, ML-DSA) sans réécriture du code de l'application (via des modules cryptographiques interchangeables).</w:t>
+      </w:r>
+    </w:p>
+    <w:p>
+      <w:pPr>
+        <w:pStyle w:val="ListParagraph"/>
+      </w:pPr>
+      <w:r>
+        <w:t>• Inventaire Cryptographique : NetSentinel intègre un module d'inventaire découvrant les algorithmes de chiffrement utilisés sur les machines critiques du parc afin d'identifier les systèmes vulnérables aux ordinateurs quantiques.</w:t>
+      </w:r>
+    </w:p>
+    <w:p>
+      <w:pPr>
+        <w:pStyle w:val="ListParagraph"/>
+      </w:pPr>
+      <w:r>
+        <w:t>• Feuille de Route de Migration : Établissement d'une migration en trois étapes : 1) Audit et inventaire cryptographique du parc, 2) Déploiement d'algorithmes hybrides (combinaison d'algorithmes classiques et post-quantiques) sur les flux de données critiques, 3) Migration complète vers des suites 100% PQC d'ici 2030 (conformément aux échéances internationales de conformité et de certification nationale "visa de sécurité").</w:t>
+      </w:r>
+    </w:p>
+    <w:p/>
     <w:p>
       <w:pPr>
         <w:pStyle w:val="Heading1"/>
@@ -5463,15 +5991,7 @@
         <w:spacing w:after="180" w:before="360"/>
       </w:pPr>
       <w:r>
-        <w:rPr>
-          <w:rFonts w:ascii="Arial" w:cs="Arial" w:eastAsia="Arial" w:hAnsi="Arial"/>
-          <w:b/>
-          <w:bCs/>
-          <w:color w:val="1A1A2E"/>
-          <w:sz w:val="36"/>
-          <w:szCs w:val="36"/>
-        </w:rPr>
-        <w:t xml:space="preserve">5. Spécifications Fonctionnelles Détaillées</w:t>
+        <w:t>7. Spécifications Fonctionnelles Détaillées</w:t>
       </w:r>
     </w:p>
     <w:p>
@@ -5488,15 +6008,7 @@
         <w:spacing w:after="120" w:before="280"/>
       </w:pPr>
       <w:r>
-        <w:rPr>
-          <w:rFonts w:ascii="Arial" w:cs="Arial" w:eastAsia="Arial" w:hAnsi="Arial"/>
-          <w:b/>
-          <w:bCs/>
-          <w:color w:val="0F3460"/>
-          <w:sz w:val="28"/>
-          <w:szCs w:val="28"/>
-        </w:rPr>
-        <w:t xml:space="preserve">5.1 Phase 1 — Scan &amp; Cartographie Réseau</w:t>
+        <w:t>7.1 Phase 1 — Scan &amp; Cartographie Réseau</w:t>
       </w:r>
     </w:p>
     <w:p>
@@ -5513,15 +6025,7 @@
         <w:spacing w:after="80" w:before="200"/>
       </w:pPr>
       <w:r>
-        <w:rPr>
-          <w:rFonts w:ascii="Arial" w:cs="Arial" w:eastAsia="Arial" w:hAnsi="Arial"/>
-          <w:b/>
-          <w:bCs/>
-          <w:color w:val="E94560"/>
-          <w:sz w:val="24"/>
-          <w:szCs w:val="24"/>
-        </w:rPr>
-        <w:t xml:space="preserve">5.1.1 Description Fonctionnelle</w:t>
+        <w:t>7.1.1 Description Fonctionnelle</w:t>
       </w:r>
     </w:p>
     <w:p>
@@ -5552,15 +6056,7 @@
         <w:spacing w:after="80" w:before="200"/>
       </w:pPr>
       <w:r>
-        <w:rPr>
-          <w:rFonts w:ascii="Arial" w:cs="Arial" w:eastAsia="Arial" w:hAnsi="Arial"/>
-          <w:b/>
-          <w:bCs/>
-          <w:color w:val="E94560"/>
-          <w:sz w:val="24"/>
-          <w:szCs w:val="24"/>
-        </w:rPr>
-        <w:t xml:space="preserve">5.1.2 Interface Utilisateur — Network Map</w:t>
+        <w:t>7.1.2 Interface Utilisateur — Network Map</w:t>
       </w:r>
     </w:p>
     <w:p>
@@ -5697,15 +6193,7 @@
         <w:spacing w:after="80" w:before="200"/>
       </w:pPr>
       <w:r>
-        <w:rPr>
-          <w:rFonts w:ascii="Arial" w:cs="Arial" w:eastAsia="Arial" w:hAnsi="Arial"/>
-          <w:b/>
-          <w:bCs/>
-          <w:color w:val="E94560"/>
-          <w:sz w:val="24"/>
-          <w:szCs w:val="24"/>
-        </w:rPr>
-        <w:t xml:space="preserve">5.1.3 Outils &amp; Commandes Orchestrées</w:t>
+        <w:t>7.1.3 Outils &amp; Commandes Orchestrées</w:t>
       </w:r>
     </w:p>
     <w:p>
@@ -6074,15 +6562,7 @@
         <w:spacing w:after="80" w:before="200"/>
       </w:pPr>
       <w:r>
-        <w:rPr>
-          <w:rFonts w:ascii="Arial" w:cs="Arial" w:eastAsia="Arial" w:hAnsi="Arial"/>
-          <w:b/>
-          <w:bCs/>
-          <w:color w:val="E94560"/>
-          <w:sz w:val="24"/>
-          <w:szCs w:val="24"/>
-        </w:rPr>
-        <w:t xml:space="preserve">5.1.4 Parsing &amp; Enrichissement</w:t>
+        <w:t>7.1.4 Parsing &amp; Enrichissement</w:t>
       </w:r>
     </w:p>
     <w:p>
@@ -6187,15 +6667,7 @@
         <w:spacing w:after="120" w:before="280"/>
       </w:pPr>
       <w:r>
-        <w:rPr>
-          <w:rFonts w:ascii="Arial" w:cs="Arial" w:eastAsia="Arial" w:hAnsi="Arial"/>
-          <w:b/>
-          <w:bCs/>
-          <w:color w:val="0F3460"/>
-          <w:sz w:val="28"/>
-          <w:szCs w:val="28"/>
-        </w:rPr>
-        <w:t xml:space="preserve">5.2 Phase 2 — Fingerprinting &amp; Analyse de Vulnérabilités</w:t>
+        <w:t>7.2 Phase 2 — Fingerprinting &amp; Analyse de Vulnérabilités</w:t>
       </w:r>
     </w:p>
     <w:p>
@@ -6212,15 +6684,7 @@
         <w:spacing w:after="80" w:before="200"/>
       </w:pPr>
       <w:r>
-        <w:rPr>
-          <w:rFonts w:ascii="Arial" w:cs="Arial" w:eastAsia="Arial" w:hAnsi="Arial"/>
-          <w:b/>
-          <w:bCs/>
-          <w:color w:val="E94560"/>
-          <w:sz w:val="24"/>
-          <w:szCs w:val="24"/>
-        </w:rPr>
-        <w:t xml:space="preserve">5.2.1 Description Fonctionnelle</w:t>
+        <w:t>7.2.1 Description Fonctionnelle</w:t>
       </w:r>
     </w:p>
     <w:p>
@@ -6251,15 +6715,7 @@
         <w:spacing w:after="80" w:before="200"/>
       </w:pPr>
       <w:r>
-        <w:rPr>
-          <w:rFonts w:ascii="Arial" w:cs="Arial" w:eastAsia="Arial" w:hAnsi="Arial"/>
-          <w:b/>
-          <w:bCs/>
-          <w:color w:val="E94560"/>
-          <w:sz w:val="24"/>
-          <w:szCs w:val="24"/>
-        </w:rPr>
-        <w:t xml:space="preserve">5.2.2 Interface Utilisateur — Device Detail View</w:t>
+        <w:t>7.2.2 Interface Utilisateur — Device Detail View</w:t>
       </w:r>
     </w:p>
     <w:p>
@@ -6396,15 +6852,7 @@
         <w:spacing w:after="80" w:before="200"/>
       </w:pPr>
       <w:r>
-        <w:rPr>
-          <w:rFonts w:ascii="Arial" w:cs="Arial" w:eastAsia="Arial" w:hAnsi="Arial"/>
-          <w:b/>
-          <w:bCs/>
-          <w:color w:val="E94560"/>
-          <w:sz w:val="24"/>
-          <w:szCs w:val="24"/>
-        </w:rPr>
-        <w:t xml:space="preserve">5.2.3 Outils &amp; Commandes Orchestrées</w:t>
+        <w:t>7.2.3 Outils &amp; Commandes Orchestrées</w:t>
       </w:r>
     </w:p>
     <w:p>
@@ -6781,15 +7229,7 @@
           </w:tcPr>
           <w:p>
             <w:r>
-              <w:rPr>
-                <w:rFonts w:ascii="Arial" w:cs="Arial" w:eastAsia="Arial" w:hAnsi="Arial"/>
-                <w:b/>
-                <w:bCs/>
-                <w:color w:val="0F3460"/>
-                <w:sz w:val="22"/>
-                <w:szCs w:val="22"/>
-              </w:rPr>
-              <w:t xml:space="preserve">Claude API</w:t>
+              <w:t>Gemini API</w:t>
             </w:r>
           </w:p>
         </w:tc>
@@ -6846,15 +7286,7 @@
         <w:spacing w:after="120" w:before="280"/>
       </w:pPr>
       <w:r>
-        <w:rPr>
-          <w:rFonts w:ascii="Arial" w:cs="Arial" w:eastAsia="Arial" w:hAnsi="Arial"/>
-          <w:b/>
-          <w:bCs/>
-          <w:color w:val="0F3460"/>
-          <w:sz w:val="28"/>
-          <w:szCs w:val="28"/>
-        </w:rPr>
-        <w:t xml:space="preserve">5.3 Phase 3 — Analyse de Trafic Réseau</w:t>
+        <w:t>7.3 Phase 3 — Analyse de Trafic Réseau</w:t>
       </w:r>
     </w:p>
     <w:p>
@@ -6871,15 +7303,7 @@
         <w:spacing w:after="80" w:before="200"/>
       </w:pPr>
       <w:r>
-        <w:rPr>
-          <w:rFonts w:ascii="Arial" w:cs="Arial" w:eastAsia="Arial" w:hAnsi="Arial"/>
-          <w:b/>
-          <w:bCs/>
-          <w:color w:val="E94560"/>
-          <w:sz w:val="24"/>
-          <w:szCs w:val="24"/>
-        </w:rPr>
-        <w:t xml:space="preserve">5.3.1 Description Fonctionnelle</w:t>
+        <w:t>7.3.1 Description Fonctionnelle</w:t>
       </w:r>
     </w:p>
     <w:p>
@@ -6910,15 +7334,7 @@
         <w:spacing w:after="80" w:before="200"/>
       </w:pPr>
       <w:r>
-        <w:rPr>
-          <w:rFonts w:ascii="Arial" w:cs="Arial" w:eastAsia="Arial" w:hAnsi="Arial"/>
-          <w:b/>
-          <w:bCs/>
-          <w:color w:val="E94560"/>
-          <w:sz w:val="24"/>
-          <w:szCs w:val="24"/>
-        </w:rPr>
-        <w:t xml:space="preserve">5.3.2 Interface Utilisateur — Traffic Dashboard</w:t>
+        <w:t>7.3.2 Interface Utilisateur — Traffic Dashboard</w:t>
       </w:r>
     </w:p>
     <w:p>
@@ -7075,15 +7491,7 @@
         <w:spacing w:after="80" w:before="200"/>
       </w:pPr>
       <w:r>
-        <w:rPr>
-          <w:rFonts w:ascii="Arial" w:cs="Arial" w:eastAsia="Arial" w:hAnsi="Arial"/>
-          <w:b/>
-          <w:bCs/>
-          <w:color w:val="E94560"/>
-          <w:sz w:val="24"/>
-          <w:szCs w:val="24"/>
-        </w:rPr>
-        <w:t xml:space="preserve">5.3.3 Outils &amp; Commandes Orchestrées</w:t>
+        <w:t>7.3.3 Outils &amp; Commandes Orchestrées</w:t>
       </w:r>
     </w:p>
     <w:p>
@@ -7525,15 +7933,7 @@
         <w:spacing w:after="120" w:before="280"/>
       </w:pPr>
       <w:r>
-        <w:rPr>
-          <w:rFonts w:ascii="Arial" w:cs="Arial" w:eastAsia="Arial" w:hAnsi="Arial"/>
-          <w:b/>
-          <w:bCs/>
-          <w:color w:val="0F3460"/>
-          <w:sz w:val="28"/>
-          <w:szCs w:val="28"/>
-        </w:rPr>
-        <w:t xml:space="preserve">5.4 Phase 4 — Interception Active (Man-in-the-Middle)</w:t>
+        <w:t>7.4 Phase 4 — Interception Active (Man-in-the-Middle)</w:t>
       </w:r>
     </w:p>
     <w:p>
@@ -7550,15 +7950,7 @@
         <w:spacing w:after="80" w:before="200"/>
       </w:pPr>
       <w:r>
-        <w:rPr>
-          <w:rFonts w:ascii="Arial" w:cs="Arial" w:eastAsia="Arial" w:hAnsi="Arial"/>
-          <w:b/>
-          <w:bCs/>
-          <w:color w:val="E94560"/>
-          <w:sz w:val="24"/>
-          <w:szCs w:val="24"/>
-        </w:rPr>
-        <w:t xml:space="preserve">5.4.1 Description Fonctionnelle</w:t>
+        <w:t>7.4.1 Description Fonctionnelle</w:t>
       </w:r>
     </w:p>
     <w:p>
@@ -7589,15 +7981,7 @@
         <w:spacing w:after="80" w:before="200"/>
       </w:pPr>
       <w:r>
-        <w:rPr>
-          <w:rFonts w:ascii="Arial" w:cs="Arial" w:eastAsia="Arial" w:hAnsi="Arial"/>
-          <w:b/>
-          <w:bCs/>
-          <w:color w:val="E94560"/>
-          <w:sz w:val="24"/>
-          <w:szCs w:val="24"/>
-        </w:rPr>
-        <w:t xml:space="preserve">5.4.2 Interface Utilisateur — Proxy Interceptor</w:t>
+        <w:t>7.4.2 Interface Utilisateur — Proxy Interceptor</w:t>
       </w:r>
     </w:p>
     <w:p>
@@ -7734,15 +8118,7 @@
         <w:spacing w:after="80" w:before="200"/>
       </w:pPr>
       <w:r>
-        <w:rPr>
-          <w:rFonts w:ascii="Arial" w:cs="Arial" w:eastAsia="Arial" w:hAnsi="Arial"/>
-          <w:b/>
-          <w:bCs/>
-          <w:color w:val="E94560"/>
-          <w:sz w:val="24"/>
-          <w:szCs w:val="24"/>
-        </w:rPr>
-        <w:t xml:space="preserve">5.4.3 Outils &amp; Commandes Orchestrées</w:t>
+        <w:t>7.4.3 Outils &amp; Commandes Orchestrées</w:t>
       </w:r>
     </w:p>
     <w:p>
@@ -8054,15 +8430,7 @@
           </w:tcPr>
           <w:p>
             <w:r>
-              <w:rPr>
-                <w:rFonts w:ascii="Arial" w:cs="Arial" w:eastAsia="Arial" w:hAnsi="Arial"/>
-                <w:b/>
-                <w:bCs/>
-                <w:color w:val="0F3460"/>
-                <w:sz w:val="22"/>
-                <w:szCs w:val="22"/>
-              </w:rPr>
-              <w:t xml:space="preserve">Claude API</w:t>
+              <w:t>Gemini API</w:t>
             </w:r>
           </w:p>
         </w:tc>
@@ -8118,6 +8486,464 @@
         <w:br w:type="page"/>
       </w:r>
     </w:p>
+    <w:p>
+      <w:pPr>
+        <w:pStyle w:val="Heading2"/>
+      </w:pPr>
+      <w:r>
+        <w:t>7.5 Validation Formelle des Plans d'Action par PDDL (Garde-Fou Agentique)</w:t>
+      </w:r>
+    </w:p>
+    <w:p>
+      <w:r>
+        <w:t>• Problématique de la Boîte Noire : Les agents IA basés sur des LLMs peuvent souffrir d'hallucinations et proposer des actions destructrices ou incohérentes (ex. isoler un serveur DHCP critique lors d'une fausse alerte).</w:t>
+      </w:r>
+    </w:p>
+    <w:p>
+      <w:r>
+        <w:t>• PDDL comme Filtre de Sécurité : NetSentinel utilise le moteur de planification PDDL comme une couche de validation formelle mathématiquement vérifiable. Les plans d'action générés par l'IA agentique (triage, blocage, remédiation) sont traduits en états et en buts PDDL, puis validés par le planificateur local.</w:t>
+      </w:r>
+    </w:p>
+    <w:p>
+      <w:r>
+        <w:t>• Contrôle Humain-Vérifiable (Human-in-the-Loop) : Si le plan proposé par l'IA viole une précondition ou un invariant logique de sécurité (ex. préserver la connectivité de la passerelle par défaut), le planificateur PDDL bloque l'action, génère une alerte d'incohérence et présente à l'analyste un arbre de décision explicable. Seuls 14% des responsables sécurité mondiaux autorisant l'autonomie complète des agents IA, ce garde-fou formel PDDL constitue le pilier de confiance de NetSentinel.</w:t>
+      </w:r>
+    </w:p>
+    <w:p/>
+    <w:p>
+      <w:pPr>
+        <w:pStyle w:val="Heading1"/>
+      </w:pPr>
+      <w:r>
+        <w:t>8. Module Intelligence Artificielle (Détaillé)</w:t>
+      </w:r>
+    </w:p>
+    <w:p>
+      <w:r>
+        <w:t>Ce module détaille l'intégration et la supervision des fonctionnalités d'intelligence artificielle au sein de la plateforme.</w:t>
+      </w:r>
+    </w:p>
+    <w:p>
+      <w:pPr>
+        <w:pStyle w:val="Heading2"/>
+      </w:pPr>
+      <w:r>
+        <w:t>8.1 Provenance et Gouvernance des Données d'Entraînement</w:t>
+      </w:r>
+    </w:p>
+    <w:p>
+      <w:r>
+        <w:t>Le module IA repose sur l'API Google Gemini 1.5 Pro. Les données d'entraînement des invites système (system prompts) proviennent de sources fiables et ouvertes :</w:t>
+      </w:r>
+    </w:p>
+    <w:p>
+      <w:pPr>
+        <w:pStyle w:val="ListParagraph"/>
+      </w:pPr>
+      <w:r>
+        <w:t>• La base de données nationale des vulnérabilités (NVD) du NIST pour les descriptions de failles et scores CVSS.</w:t>
+      </w:r>
+    </w:p>
+    <w:p>
+      <w:pPr>
+        <w:pStyle w:val="ListParagraph"/>
+      </w:pPr>
+      <w:r>
+        <w:t>• Les référentiels de sécurité OWASP (Web and Mobile Security Projects) pour la remédiation.</w:t>
+      </w:r>
+    </w:p>
+    <w:p>
+      <w:pPr>
+        <w:pStyle w:val="ListParagraph"/>
+      </w:pPr>
+      <w:r>
+        <w:t>• Des documentations officielles d'outils réseau open-source (nmap, Wireshark, mitmproxy).</w:t>
+      </w:r>
+    </w:p>
+    <w:p>
+      <w:r>
+        <w:t>Gouvernance : Aucune donnée de capture réseau contenant des informations personnelles identifiables (PII) n'est transmise aux serveurs de Google. Seules les métadonnées anonymisées (identifiants de ports, numéros de CVE, versions de logiciels détectées) sont envoyées à l'API après consentement de l'utilisateur. Google n'utilise pas ces requêtes pour entraîner ses modèles (mode API payante avec clause de confidentialité stricte).</w:t>
+      </w:r>
+    </w:p>
+    <w:p>
+      <w:pPr>
+        <w:pStyle w:val="Heading2"/>
+      </w:pPr>
+      <w:r>
+        <w:t>8.2 Cadence de Ré-entraînement et Mises à Jour</w:t>
+      </w:r>
+    </w:p>
+    <w:p>
+      <w:pPr>
+        <w:pStyle w:val="ListParagraph"/>
+      </w:pPr>
+      <w:r>
+        <w:t>• Base de connaissances locale : synchronisation quotidienne avec l'API NVD pour les nouvelles signatures de vulnérabilités.</w:t>
+      </w:r>
+    </w:p>
+    <w:p>
+      <w:pPr>
+        <w:pStyle w:val="ListParagraph"/>
+      </w:pPr>
+      <w:r>
+        <w:t>• Modèles d'invites IA : mise à jour mensuelle des structures d'invites système par l'équipe de développement pour intégrer les nouveaux vecteurs d'attaque détectés dans la communauté.</w:t>
+      </w:r>
+    </w:p>
+    <w:p>
+      <w:pPr>
+        <w:pStyle w:val="Heading2"/>
+      </w:pPr>
+      <w:r>
+        <w:t>8.3 Mécanisme d'Explicabilité (XAI)</w:t>
+      </w:r>
+    </w:p>
+    <w:p>
+      <w:r>
+        <w:t>Pour garantir la transparence pédagogique, chaque recommandation IA doit être étayée. L'IA génère un rapport structuré découpé en trois parties :</w:t>
+      </w:r>
+    </w:p>
+    <w:p>
+      <w:pPr>
+        <w:pStyle w:val="ListParagraph"/>
+      </w:pPr>
+      <w:r>
+        <w:t>1. Constat (Evidence) : Rappel des éléments factuels ayant mené au diagnostic (ex. 'Port 21 ouvert détecté avec service vsftpd 2.3.4').</w:t>
+      </w:r>
+    </w:p>
+    <w:p>
+      <w:pPr>
+        <w:pStyle w:val="ListParagraph"/>
+      </w:pPr>
+      <w:r>
+        <w:t>2. Explication logique : Vulgarisation du fonctionnement technique de la faille corrélée (ex. backdoor connue dans cette version de service).</w:t>
+      </w:r>
+    </w:p>
+    <w:p>
+      <w:pPr>
+        <w:pStyle w:val="ListParagraph"/>
+      </w:pPr>
+      <w:r>
+        <w:t>3. Remédiation : Instructions étape par étape pour corriger la faille (ex. mise à jour du paquet ou modification du fichier de configuration).</w:t>
+      </w:r>
+    </w:p>
+    <w:p>
+      <w:pPr>
+        <w:pStyle w:val="Heading2"/>
+      </w:pPr>
+      <w:r>
+        <w:t>8.4 Supervision Humaine (Human-in-the-Loop)</w:t>
+      </w:r>
+    </w:p>
+    <w:p>
+      <w:r>
+        <w:t>Conformément aux principes éthiques du projet, l'IA agit uniquement comme un assistant décisionnel. L'IA ne dispose d'aucun droit d'écriture direct sur le réseau ou le système hôte. Toute action de remédiation recommandée par l'IA (comme bloquer une adresse IP ou isoler un appareil) doit être explicitement validée par l'opérateur humain via une boîte de confirmation dans l'interface graphique de NetSentinel.</w:t>
+      </w:r>
+    </w:p>
+    <w:p/>
+    <w:p>
+      <w:pPr>
+        <w:pStyle w:val="Heading2"/>
+      </w:pPr>
+      <w:r>
+        <w:t>8.5 Sécurisation et Gouvernance des Agents IA (Modèle de Confiance Cisco 2026)</w:t>
+      </w:r>
+    </w:p>
+    <w:p>
+      <w:r>
+        <w:t>Les statistiques de 2026 montrant que 88% des organisations font face à des incidents liés aux agents IA en raison d'un manque de supervision et de journalisation, NetSentinel applique une politique stricte de sécurité des agents IA articulée autour de trois axes :</w:t>
+      </w:r>
+    </w:p>
+    <w:p>
+      <w:pPr>
+        <w:pStyle w:val="ListParagraph"/>
+      </w:pPr>
+      <w:r>
+        <w:t>• Axe 1 — Protéger le monde des agents (Contrôle d'action) : Les agents IA s'exécutent dans des bacs à sable stricts (sandboxing Electron/Node). Leurs habilitations sont limitées via le protocole PolicyKit. Aucun agent ne peut exécuter de commandes shell arbitraires.</w:t>
+      </w:r>
+    </w:p>
+    <w:p>
+      <w:pPr>
+        <w:pStyle w:val="ListParagraph"/>
+      </w:pPr>
+      <w:r>
+        <w:t>• Axe 2 — Protéger les agents du monde (Robustesse et Intégrité) : Mise en œuvre de filtres de nettoyage (input sanitization) pour bloquer les attaques par injection de prompts (Prompt Injection) et d'analyses heuristiques sur les flux réseau pour empêcher l'empoisonnement de modèle (Model Poisoning) via des paquets malveillants.</w:t>
+      </w:r>
+    </w:p>
+    <w:p>
+      <w:pPr>
+        <w:pStyle w:val="ListParagraph"/>
+      </w:pPr>
+      <w:r>
+        <w:t>• Axe 3 — Détection et Réponse à la vitesse machine (Audit &amp; Journalisation) : Chaque agent IA dispose de ses propres identifiants et clés API cryptographiques (pas de clés d'API partagées). Enregistrement systématique de toutes les interactions agent-système (prompts, réponses, actions décidées, scores de confiance) dans une table d'audit SQLite locale chiffrée, permettant une traçabilité forensic complète.</w:t>
+      </w:r>
+    </w:p>
+    <w:p/>
+    <w:p>
+      <w:pPr>
+        <w:pStyle w:val="Heading1"/>
+      </w:pPr>
+      <w:r>
+        <w:t>9. Module Cybersécurité (Détaillé)</w:t>
+      </w:r>
+    </w:p>
+    <w:p>
+      <w:r>
+        <w:t>Cette section détaille les protocoles de réponse aux incidents, les politiques de journalisation et d'intégration de NetSentinel.</w:t>
+      </w:r>
+    </w:p>
+    <w:p>
+      <w:pPr>
+        <w:pStyle w:val="Heading2"/>
+      </w:pPr>
+      <w:r>
+        <w:t>9.1 Playbooks d'Incident par Type de Menace</w:t>
+      </w:r>
+    </w:p>
+    <w:p>
+      <w:r>
+        <w:t>L'application intègre des playbooks de sécurité interactifs pour guider l'opérateur lors de la détection de menaces courantes :</w:t>
+      </w:r>
+    </w:p>
+    <w:p>
+      <w:pPr>
+        <w:pStyle w:val="ListParagraph"/>
+      </w:pPr>
+      <w:r>
+        <w:t>• Playbook ARP Spoofing : Détection d'un conflit d'adresses MAC -&gt; Alerte prioritaire -&gt; Suggestion d'exécution du plan d'isolement (PDDL isolate-system) -&gt; Envoi de paquets ARP légitimes pour restaurer la table ARP -&gt; Blocage MAC de l'attaquant au niveau du commutateur local.</w:t>
+      </w:r>
+    </w:p>
+    <w:p>
+      <w:pPr>
+        <w:pStyle w:val="ListParagraph"/>
+      </w:pPr>
+      <w:r>
+        <w:t>• Playbook Port Scan Agressif : Détection de scans SYN rapides -&gt; Identification de la source -&gt; Option d'ajout automatique d'une règle iptables sur le poste pour bloquer l'IP scanneuse.</w:t>
+      </w:r>
+    </w:p>
+    <w:p>
+      <w:pPr>
+        <w:pStyle w:val="ListParagraph"/>
+      </w:pPr>
+      <w:r>
+        <w:t>• Playbook Credentials Leak : Interception d'un mot de passe FTP/Telnet en clair -&gt; Identification de la machine victime -&gt; Notification push -&gt; Proposition de génération d'un mot de passe fort et envoi d'une alerte à l'administrateur.</w:t>
+      </w:r>
+    </w:p>
+    <w:p>
+      <w:pPr>
+        <w:pStyle w:val="Heading2"/>
+      </w:pPr>
+      <w:r>
+        <w:t>9.2 Politique de Rétention des Logs</w:t>
+      </w:r>
+    </w:p>
+    <w:p>
+      <w:pPr>
+        <w:pStyle w:val="ListParagraph"/>
+      </w:pPr>
+      <w:r>
+        <w:t>• Les captures brutes de trafic réseau (.pcap) sont conservées localement pendant un maximum de 30 jours pour limiter la consommation d'espace disque.</w:t>
+      </w:r>
+    </w:p>
+    <w:p>
+      <w:pPr>
+        <w:pStyle w:val="ListParagraph"/>
+      </w:pPr>
+      <w:r>
+        <w:t>• Les rapports de scans de vulnérabilités et l'historique des sessions d'audit sont stockés dans la base SQLite locale pendant 90 jours avant d'être archivés de manière compressée ou purgés.</w:t>
+      </w:r>
+    </w:p>
+    <w:p>
+      <w:pPr>
+        <w:pStyle w:val="Heading2"/>
+      </w:pPr>
+      <w:r>
+        <w:t>9.3 Gestion et Remédiation des Vulnérabilités</w:t>
+      </w:r>
+    </w:p>
+    <w:p>
+      <w:pPr>
+        <w:pStyle w:val="ListParagraph"/>
+      </w:pPr>
+      <w:r>
+        <w:t>• Intégration de scripts NSE de nmap avec la base locale CVE pour détecter et qualifier instantanément la gravité des failles logicielles.</w:t>
+      </w:r>
+    </w:p>
+    <w:p>
+      <w:pPr>
+        <w:pStyle w:val="ListParagraph"/>
+      </w:pPr>
+      <w:r>
+        <w:t>• Liaison dynamique avec les bases de correctifs officiels des distributions Linux pour suggérer les commandes apt de mise à jour exactes.</w:t>
+      </w:r>
+    </w:p>
+    <w:p>
+      <w:pPr>
+        <w:pStyle w:val="Heading2"/>
+      </w:pPr>
+      <w:r>
+        <w:t>9.4 Protocoles d'Intégration Tiers (Banques, Hôpitaux)</w:t>
+      </w:r>
+    </w:p>
+    <w:p>
+      <w:pPr>
+        <w:pStyle w:val="ListParagraph"/>
+      </w:pPr>
+      <w:r>
+        <w:t>• NetSentinel supporte l'exportation des logs d'audit au format standardisé Syslog RFC 5424 pour une intégration transparente avec les SIEM (Splunk, QRadar, ELK) utilisés dans les banques et hôpitaux.</w:t>
+      </w:r>
+    </w:p>
+    <w:p>
+      <w:r>
+        <w:t>• Export de rapports conformes aux standards de gouvernance et conformité PCI-DSS (transactions bancaires) et HIPAA (protection des données médicales).</w:t>
+      </w:r>
+    </w:p>
+    <w:p>
+      <w:pPr>
+        <w:pStyle w:val="Heading2"/>
+      </w:pPr>
+      <w:r>
+        <w:t>9.5 Modèle de Planification PDDL d'Remédiation</w:t>
+      </w:r>
+    </w:p>
+    <w:p>
+      <w:r>
+        <w:t>Pour automatiser et optimiser l'enchaînement des actions de remédiation, NetSentinel utilise un planificateur PDDL (Planning Domain Definition Language). Voici la définition formelle du domaine contenant les actions d'isolement, d'alerte, de correctif (patch) et de basculement vers un système de sauvegarde (basculer) :</w:t>
+      </w:r>
+    </w:p>
+    <w:p>
+      <w:r>
+        <w:t>(define (domain netsentinel-remediation)</w:t>
+        <w:br/>
+        <w:t xml:space="preserve">  (:requirements :strips :typing)</w:t>
+        <w:br/>
+        <w:t xml:space="preserve">  (:types host threat)</w:t>
+        <w:br/>
+        <w:t xml:space="preserve">  (:predicates</w:t>
+        <w:br/>
+        <w:t xml:space="preserve">    (isolated ?h - host)</w:t>
+        <w:br/>
+        <w:t xml:space="preserve">    (patched ?h - host)</w:t>
+        <w:br/>
+        <w:t xml:space="preserve">    (compromised ?h - host)</w:t>
+        <w:br/>
+        <w:t xml:space="preserve">    (threat-detected ?t - threat ?h - host)</w:t>
+        <w:br/>
+        <w:t xml:space="preserve">    (alerted ?h - host)</w:t>
+        <w:br/>
+        <w:t xml:space="preserve">    (backup-active ?h - host)</w:t>
+        <w:br/>
+        <w:t xml:space="preserve">  )</w:t>
+        <w:br/>
+        <w:t xml:space="preserve">  (:action isolate-system</w:t>
+        <w:br/>
+        <w:t xml:space="preserve">    :parameters (?h - host)</w:t>
+        <w:br/>
+        <w:t xml:space="preserve">    :precondition (compromised ?h)</w:t>
+        <w:br/>
+        <w:t xml:space="preserve">    :effect (and (isolated ?h) (not (compromised ?h)))</w:t>
+        <w:br/>
+        <w:t xml:space="preserve">  )</w:t>
+        <w:br/>
+        <w:t xml:space="preserve">  (:action patch-system</w:t>
+        <w:br/>
+        <w:t xml:space="preserve">    :parameters (?h - host)</w:t>
+        <w:br/>
+        <w:t xml:space="preserve">    :precondition (and (isolated ?h) (not (patched ?h)))</w:t>
+        <w:br/>
+        <w:t xml:space="preserve">    :effect (patched ?h)</w:t>
+        <w:br/>
+        <w:t xml:space="preserve">  )</w:t>
+        <w:br/>
+        <w:t xml:space="preserve">  (:action alert-admin</w:t>
+        <w:br/>
+        <w:t xml:space="preserve">    :parameters (?h - host ?t - threat)</w:t>
+        <w:br/>
+        <w:t xml:space="preserve">    :precondition (threat-detected ?t ?h)</w:t>
+        <w:br/>
+        <w:t xml:space="preserve">    :effect (alerted ?h)</w:t>
+        <w:br/>
+        <w:t xml:space="preserve">  )</w:t>
+        <w:br/>
+        <w:t xml:space="preserve">  (:action switch-to-backup</w:t>
+        <w:br/>
+        <w:t xml:space="preserve">    :parameters (?h - host)</w:t>
+        <w:br/>
+        <w:t xml:space="preserve">    :precondition (isolated ?h)</w:t>
+        <w:br/>
+        <w:t xml:space="preserve">    :effect (backup-active ?h)</w:t>
+        <w:br/>
+        <w:t xml:space="preserve">  )</w:t>
+        <w:br/>
+        <w:t>)</w:t>
+      </w:r>
+    </w:p>
+    <w:p/>
+    <w:p>
+      <w:pPr>
+        <w:pStyle w:val="Heading2"/>
+      </w:pPr>
+      <w:r>
+        <w:t>9.6 Architecture de SOC Agentique &amp; Protocole MCP</w:t>
+      </w:r>
+    </w:p>
+    <w:p>
+      <w:pPr>
+        <w:pStyle w:val="ListParagraph"/>
+      </w:pPr>
+      <w:r>
+        <w:t>• Agents IA de Triage Automatique : Déploiement d'agents autonomes de niveau 1 (L1) chargés d'analyser en continu le flux d'alertes réseau, de corréler les événements similaires et de filtrer les faux positifs pour réduire la fatigue d'alerte des analystes.</w:t>
+      </w:r>
+    </w:p>
+    <w:p>
+      <w:pPr>
+        <w:pStyle w:val="ListParagraph"/>
+      </w:pPr>
+      <w:r>
+        <w:t>• Copilotes LLM pour Analystes : Génération automatique de résumés d'incidents complexes et de rapports d'audit de vulnérabilités rédigés de manière bilingue en Français et Kirundi, facilitant la communication technique et administrative.</w:t>
+      </w:r>
+    </w:p>
+    <w:p>
+      <w:pPr>
+        <w:pStyle w:val="ListParagraph"/>
+      </w:pPr>
+      <w:r>
+        <w:t>• Orchestration multi-agents et Support MCP (Model Context Protocol) : Utilisation du protocole standard MCP pour maintenir un contexte partagé et synchronisé en temps réel entre les différents outils de détection (nmap, tshark), d'investigation (Gemini) et de réponse (PDDL/scripts d'isolement).</w:t>
+      </w:r>
+    </w:p>
+    <w:p/>
+    <w:p>
+      <w:pPr>
+        <w:pStyle w:val="Heading2"/>
+      </w:pPr>
+      <w:r>
+        <w:t>9.7 Gestion Continue de l'Exposition aux Menaces (CTEM)</w:t>
+      </w:r>
+    </w:p>
+    <w:p>
+      <w:pPr>
+        <w:pStyle w:val="ListParagraph"/>
+      </w:pPr>
+      <w:r>
+        <w:t>• Cartographie Permanente des Actifs : Au-delà des audits nmap ponctuels, NetSentinel orchestre des scans passifs et actifs programmés pour maintenir à jour en continu l'inventaire des équipements connectés.</w:t>
+      </w:r>
+    </w:p>
+    <w:p>
+      <w:pPr>
+        <w:pStyle w:val="ListParagraph"/>
+      </w:pPr>
+      <w:r>
+        <w:t>• Simulation d'Attaque Automatisée (Breach &amp; Attack Simulation - BAS) : Modules intégrés de simulation d'attaques inoffensives (ex. requêtes ARP ou DNS suspectes) pour valider l'efficacité opérationnelle des honeypots locaux et de la détection de NetSentinel.</w:t>
+      </w:r>
+    </w:p>
+    <w:p>
+      <w:pPr>
+        <w:pStyle w:val="ListParagraph"/>
+      </w:pPr>
+      <w:r>
+        <w:t>• Priorisation par l'Exploitabilité Réelle (EPSS) : Intégration du score EPSS (Exploit Prediction Scoring System) et du framework SSVC (Stakeholder Collaborative Vulnerability Categorization) dans la base SQLite locale. Les vulnérabilités découvertes sont priorisées selon leur exploitabilité active sur le web et leur impact local, et non plus sur le seul score CVSS brut.</w:t>
+      </w:r>
+    </w:p>
+    <w:p/>
     <w:p>
       <w:pPr>
         <w:pStyle w:val="Heading1"/>
@@ -8127,15 +8953,7 @@
         <w:spacing w:after="180" w:before="360"/>
       </w:pPr>
       <w:r>
-        <w:rPr>
-          <w:rFonts w:ascii="Arial" w:cs="Arial" w:eastAsia="Arial" w:hAnsi="Arial"/>
-          <w:b/>
-          <w:bCs/>
-          <w:color w:val="1A1A2E"/>
-          <w:sz w:val="36"/>
-          <w:szCs w:val="36"/>
-        </w:rPr>
-        <w:t xml:space="preserve">6. Fonctionnalités Transverses</w:t>
+        <w:t>10. Fonctionnalités Transverses</w:t>
       </w:r>
     </w:p>
     <w:p>
@@ -8152,15 +8970,7 @@
         <w:spacing w:after="120" w:before="280"/>
       </w:pPr>
       <w:r>
-        <w:rPr>
-          <w:rFonts w:ascii="Arial" w:cs="Arial" w:eastAsia="Arial" w:hAnsi="Arial"/>
-          <w:b/>
-          <w:bCs/>
-          <w:color w:val="0F3460"/>
-          <w:sz w:val="28"/>
-          <w:szCs w:val="28"/>
-        </w:rPr>
-        <w:t xml:space="preserve">6.1 Assistant IA Intégré (Claude API)</w:t>
+        <w:t>10.1 Assistant IA Intégré (Gemini API)</w:t>
       </w:r>
     </w:p>
     <w:p>
@@ -8259,15 +9069,7 @@
         <w:spacing w:after="120" w:before="280"/>
       </w:pPr>
       <w:r>
-        <w:rPr>
-          <w:rFonts w:ascii="Arial" w:cs="Arial" w:eastAsia="Arial" w:hAnsi="Arial"/>
-          <w:b/>
-          <w:bCs/>
-          <w:color w:val="0F3460"/>
-          <w:sz w:val="28"/>
-          <w:szCs w:val="28"/>
-        </w:rPr>
-        <w:t xml:space="preserve">6.2 Système de Rapports</w:t>
+        <w:t>10.2 Système de Rapports</w:t>
       </w:r>
     </w:p>
     <w:p>
@@ -8364,15 +9166,7 @@
         <w:spacing w:after="120" w:before="280"/>
       </w:pPr>
       <w:r>
-        <w:rPr>
-          <w:rFonts w:ascii="Arial" w:cs="Arial" w:eastAsia="Arial" w:hAnsi="Arial"/>
-          <w:b/>
-          <w:bCs/>
-          <w:color w:val="0F3460"/>
-          <w:sz w:val="28"/>
-          <w:szCs w:val="28"/>
-        </w:rPr>
-        <w:t xml:space="preserve">6.3 Gestion de Sessions &amp; Historique</w:t>
+        <w:t>10.3 Gestion de Sessions &amp; Historique</w:t>
       </w:r>
     </w:p>
     <w:p>
@@ -8449,15 +9243,7 @@
         <w:spacing w:after="120" w:before="280"/>
       </w:pPr>
       <w:r>
-        <w:rPr>
-          <w:rFonts w:ascii="Arial" w:cs="Arial" w:eastAsia="Arial" w:hAnsi="Arial"/>
-          <w:b/>
-          <w:bCs/>
-          <w:color w:val="0F3460"/>
-          <w:sz w:val="28"/>
-          <w:szCs w:val="28"/>
-        </w:rPr>
-        <w:t xml:space="preserve">6.4 Interface &amp; UX</w:t>
+        <w:t>10.4 Interface &amp; UX</w:t>
       </w:r>
     </w:p>
     <w:p>
@@ -8584,21 +9370,251 @@
     <w:p>
       <w:pPr>
         <w:pStyle w:val="Heading1"/>
+      </w:pPr>
+      <w:r>
+        <w:t>11. Équipe &amp; Gouvernance</w:t>
+      </w:r>
+    </w:p>
+    <w:p>
+      <w:r>
+        <w:t>Cette section décrit le modèle opérationnel et la gouvernance globale du projet NetSentinel.</w:t>
+      </w:r>
+    </w:p>
+    <w:p>
+      <w:pPr>
+        <w:pStyle w:val="Heading2"/>
+      </w:pPr>
+      <w:r>
+        <w:t>11.1 Organigramme du Projet</w:t>
+      </w:r>
+    </w:p>
+    <w:p>
+      <w:pPr>
+        <w:pStyle w:val="ListParagraph"/>
+      </w:pPr>
+      <w:r>
+        <w:t>• Comité de Pilotage (COPIL) : Représentants ministériels, DSI et partenaires académiques. Valide les orientations stratégiques.</w:t>
+      </w:r>
+    </w:p>
+    <w:p>
+      <w:pPr>
+        <w:pStyle w:val="ListParagraph"/>
+      </w:pPr>
+      <w:r>
+        <w:t>• Directeur de Projet : Gestion administrative, budget, liaison institutionnelle.</w:t>
+      </w:r>
+    </w:p>
+    <w:p>
+      <w:pPr>
+        <w:pStyle w:val="ListParagraph"/>
+      </w:pPr>
+      <w:r>
+        <w:t>• Tech Lead &amp; Architecte : Choix technologiques, validation de la sécurité et des performances de la plateforme.</w:t>
+      </w:r>
+    </w:p>
+    <w:p>
+      <w:pPr>
+        <w:pStyle w:val="ListParagraph"/>
+      </w:pPr>
+      <w:r>
+        <w:t>• Équipe de Développement (Frontend React / Backend Node.js) : Implémentation de l'application et intégration des outils.</w:t>
+      </w:r>
+    </w:p>
+    <w:p>
+      <w:pPr>
+        <w:pStyle w:val="ListParagraph"/>
+      </w:pPr>
+      <w:r>
+        <w:t>• Expert en Cybersécurité : Conception des playbooks d'incident, modélisation PDDL, tests d'intrusion de l'application.</w:t>
+      </w:r>
+    </w:p>
+    <w:p>
+      <w:pPr>
+        <w:pStyle w:val="Heading2"/>
+      </w:pPr>
+      <w:r>
+        <w:t>11.2 Cartographie des Parties Prenantes</w:t>
+      </w:r>
+    </w:p>
+    <w:p>
+      <w:pPr>
+        <w:pStyle w:val="ListParagraph"/>
+      </w:pPr>
+      <w:r>
+        <w:t>• Ministère de la Transition Numérique et des Postes (Burundi) : Commanditaire principal, assure le financement public et la validation politique.</w:t>
+      </w:r>
+    </w:p>
+    <w:p>
+      <w:pPr>
+        <w:pStyle w:val="ListParagraph"/>
+      </w:pPr>
+      <w:r>
+        <w:t>• Banque de la République du Burundi (BRB) : Conseiller sur les exigences de conformité pour le secteur financier et bancaire.</w:t>
+      </w:r>
+    </w:p>
+    <w:p>
+      <w:pPr>
+        <w:pStyle w:val="ListParagraph"/>
+      </w:pPr>
+      <w:r>
+        <w:t>• Universités Nationales (ex. Université du Burundi) : Partenaires d'intégration pour les programmes de formation académique en cybersécurité.</w:t>
+      </w:r>
+    </w:p>
+    <w:p>
+      <w:pPr>
+        <w:pStyle w:val="ListParagraph"/>
+      </w:pPr>
+      <w:r>
+        <w:t>• Partenaires Internationaux (UIT, CERT régionaux) : Collaboration sur le partage de renseignements sur les menaces émergentes.</w:t>
+      </w:r>
+    </w:p>
+    <w:p>
+      <w:pPr>
+        <w:pStyle w:val="Heading2"/>
+      </w:pPr>
+      <w:r>
+        <w:t>11.3 Fréquence de Reporting et Jalons</w:t>
+      </w:r>
+    </w:p>
+    <w:p>
+      <w:pPr>
+        <w:pStyle w:val="ListParagraph"/>
+      </w:pPr>
+      <w:r>
+        <w:t>• Équipe Technique : Stand-up quotidiens et revues de sprint toutes les deux semaines (Agile Scrum).</w:t>
+      </w:r>
+    </w:p>
+    <w:p>
+      <w:pPr>
+        <w:pStyle w:val="ListParagraph"/>
+      </w:pPr>
+      <w:r>
+        <w:t>• Comité de Pilotage : Réunion mensuelle avec rapport de progression (KPIs de roadmap et consomation budgétaire).</w:t>
+      </w:r>
+    </w:p>
+    <w:p>
+      <w:pPr>
+        <w:pStyle w:val="ListParagraph"/>
+      </w:pPr>
+      <w:r>
+        <w:t>• Rapports trimestriels de sécurité remis à la DSI nationale pour validation de la conformité souveraine.</w:t>
+      </w:r>
+    </w:p>
+    <w:p/>
+    <w:p>
+      <w:pPr>
+        <w:pStyle w:val="Heading1"/>
+      </w:pPr>
+      <w:r>
+        <w:t>12. Budget Estimatif (Détaillé)</w:t>
+      </w:r>
+    </w:p>
+    <w:p>
+      <w:r>
+        <w:t>Cette section détaille le chiffrage financier requis pour le développement, le déploiement et la maintenance de NetSentinel.</w:t>
+      </w:r>
+    </w:p>
+    <w:p>
+      <w:pPr>
+        <w:pStyle w:val="Heading2"/>
+      </w:pPr>
+      <w:r>
+        <w:t>12.1 Ventilation Budgétaire</w:t>
+      </w:r>
+    </w:p>
+    <w:p>
+      <w:r>
+        <w:t>Le budget total estimé de 3,2M USD est ventilé de la manière suivante :</w:t>
+      </w:r>
+    </w:p>
+    <w:p>
+      <w:pPr>
+        <w:pStyle w:val="ListParagraph"/>
+      </w:pPr>
+      <w:r>
+        <w:t>• R&amp;D et Personnel (Ingénieurs R&amp;D, Tech Lead, Spécialiste Cyber, QA) : $1,800,000</w:t>
+      </w:r>
+    </w:p>
+    <w:p>
+      <w:pPr>
+        <w:pStyle w:val="ListParagraph"/>
+      </w:pPr>
+      <w:r>
+        <w:t>• Infrastructure et Lab de Test (Achat de matériel réseau, serveurs de test) : $450,000</w:t>
+      </w:r>
+    </w:p>
+    <w:p>
+      <w:pPr>
+        <w:pStyle w:val="ListParagraph"/>
+      </w:pPr>
+      <w:r>
+        <w:t>• Licences et Services Cloud (Services de calcul, abonnements APIs Gemini) : $250,000</w:t>
+      </w:r>
+    </w:p>
+    <w:p>
+      <w:pPr>
+        <w:pStyle w:val="ListParagraph"/>
+      </w:pPr>
+      <w:r>
+        <w:t>• Déploiement et Formation (Ateliers pour les DSI ministérielles et universités) : $300,000</w:t>
+      </w:r>
+    </w:p>
+    <w:p>
+      <w:pPr>
+        <w:pStyle w:val="ListParagraph"/>
+      </w:pPr>
+      <w:r>
+        <w:t>• Réserve de Contingence (15% pour faire face aux imprévus d'infrastructure) : $400,000</w:t>
+      </w:r>
+    </w:p>
+    <w:p>
+      <w:pPr>
+        <w:pStyle w:val="Heading2"/>
+      </w:pPr>
+      <w:r>
+        <w:t>12.2 Sources de Financement</w:t>
+      </w:r>
+    </w:p>
+    <w:p>
+      <w:pPr>
+        <w:pStyle w:val="ListParagraph"/>
+      </w:pPr>
+      <w:r>
+        <w:t>• Fonds de Transition Numérique de l'État : 50% ($1,600,000).</w:t>
+      </w:r>
+    </w:p>
+    <w:p>
+      <w:pPr>
+        <w:pStyle w:val="ListParagraph"/>
+      </w:pPr>
+      <w:r>
+        <w:t>• Prêts et dons de développement multilatéraux (ex. Banque Mondiale) : 50% ($1,600,000).</w:t>
+      </w:r>
+    </w:p>
+    <w:p>
+      <w:pPr>
+        <w:pStyle w:val="Heading2"/>
+      </w:pPr>
+      <w:r>
+        <w:t>12.3 Benchmark International &amp; Justification du Coût</w:t>
+      </w:r>
+    </w:p>
+    <w:p>
+      <w:r>
+        <w:t>Alors que la création de centres CSIRT (Computer Security Incident Response Team) nationaux physiques se chiffre habituellement entre 10 et 50 millions de USD en raison des coûts d'infrastructure immobilière, de liaisons satellites dédiées et de matériel de calcul lourd, NetSentinel présente un budget extrêmement optimisé de 3,2 millions de USD. Ce coût modéré s'explique par le fait qu'il s'agit d'une plateforme logicielle d'orchestration légère conçue pour s'exécuter directement sur des postes de travail clients sous Ubuntu 24.04, éliminant ainsi les coûts de génie civil et d'infrastructure physique lourde.</w:t>
+      </w:r>
+    </w:p>
+    <w:p/>
+    <w:p>
+      <w:pPr>
+        <w:pStyle w:val="Heading1"/>
         <w:pBdr>
           <w:bottom w:val="single" w:color="E94560" w:sz="8" w:space="6"/>
         </w:pBdr>
         <w:spacing w:after="180" w:before="360"/>
       </w:pPr>
       <w:r>
-        <w:rPr>
-          <w:rFonts w:ascii="Arial" w:cs="Arial" w:eastAsia="Arial" w:hAnsi="Arial"/>
-          <w:b/>
-          <w:bCs/>
-          <w:color w:val="1A1A2E"/>
-          <w:sz w:val="36"/>
-          <w:szCs w:val="36"/>
-        </w:rPr>
-        <w:t xml:space="preserve">7. Exigences Non Fonctionnelles</w:t>
+        <w:t>13. Exigences Non Fonctionnelles</w:t>
       </w:r>
     </w:p>
     <w:p>
@@ -8615,15 +9631,7 @@
         <w:spacing w:after="120" w:before="280"/>
       </w:pPr>
       <w:r>
-        <w:rPr>
-          <w:rFonts w:ascii="Arial" w:cs="Arial" w:eastAsia="Arial" w:hAnsi="Arial"/>
-          <w:b/>
-          <w:bCs/>
-          <w:color w:val="0F3460"/>
-          <w:sz w:val="28"/>
-          <w:szCs w:val="28"/>
-        </w:rPr>
-        <w:t xml:space="preserve">7.1 Performance</w:t>
+        <w:t>13.1 Performance</w:t>
       </w:r>
     </w:p>
     <w:p>
@@ -9065,15 +10073,7 @@
         <w:spacing w:after="120" w:before="280"/>
       </w:pPr>
       <w:r>
-        <w:rPr>
-          <w:rFonts w:ascii="Arial" w:cs="Arial" w:eastAsia="Arial" w:hAnsi="Arial"/>
-          <w:b/>
-          <w:bCs/>
-          <w:color w:val="0F3460"/>
-          <w:sz w:val="28"/>
-          <w:szCs w:val="28"/>
-        </w:rPr>
-        <w:t xml:space="preserve">7.2 Compatibilité Système</w:t>
+        <w:t>13.2 Compatibilité Système</w:t>
       </w:r>
     </w:p>
     <w:p>
@@ -9645,15 +10645,7 @@
         <w:spacing w:after="120" w:before="280"/>
       </w:pPr>
       <w:r>
-        <w:rPr>
-          <w:rFonts w:ascii="Arial" w:cs="Arial" w:eastAsia="Arial" w:hAnsi="Arial"/>
-          <w:b/>
-          <w:bCs/>
-          <w:color w:val="0F3460"/>
-          <w:sz w:val="28"/>
-          <w:szCs w:val="28"/>
-        </w:rPr>
-        <w:t xml:space="preserve">7.3 Sécurité de l'Application</w:t>
+        <w:t>13.3 Sécurité de l'Application</w:t>
       </w:r>
     </w:p>
     <w:p>
@@ -9667,13 +10659,7 @@
         <w:ind w:left="720" w:hanging="360"/>
       </w:pPr>
       <w:r>
-        <w:rPr>
-          <w:rFonts w:ascii="Arial" w:cs="Arial" w:eastAsia="Arial" w:hAnsi="Arial"/>
-          <w:color w:val="1F2937"/>
-          <w:sz w:val="22"/>
-          <w:szCs w:val="22"/>
-        </w:rPr>
-        <w:t xml:space="preserve">Aucune donnée envoyée vers des serveurs externes sauf API Claude (opt-in)</w:t>
+        <w:t>Aucune donnée envoyée vers des serveurs externes sauf API Gemini (opt-in)</w:t>
       </w:r>
     </w:p>
     <w:p>
@@ -9786,15 +10772,7 @@
         <w:spacing w:after="180" w:before="360"/>
       </w:pPr>
       <w:r>
-        <w:rPr>
-          <w:rFonts w:ascii="Arial" w:cs="Arial" w:eastAsia="Arial" w:hAnsi="Arial"/>
-          <w:b/>
-          <w:bCs/>
-          <w:color w:val="1A1A2E"/>
-          <w:sz w:val="36"/>
-          <w:szCs w:val="36"/>
-        </w:rPr>
-        <w:t xml:space="preserve">8. Installation &amp; Déploiement Ubuntu 24.04</w:t>
+        <w:t>14. Installation &amp; Déploiement Ubuntu 24.04</w:t>
       </w:r>
     </w:p>
     <w:p>
@@ -9811,15 +10789,7 @@
         <w:spacing w:after="120" w:before="280"/>
       </w:pPr>
       <w:r>
-        <w:rPr>
-          <w:rFonts w:ascii="Arial" w:cs="Arial" w:eastAsia="Arial" w:hAnsi="Arial"/>
-          <w:b/>
-          <w:bCs/>
-          <w:color w:val="0F3460"/>
-          <w:sz w:val="28"/>
-          <w:szCs w:val="28"/>
-        </w:rPr>
-        <w:t xml:space="preserve">8.1 Prérequis Système</w:t>
+        <w:t>14.1 Prérequis Système</w:t>
       </w:r>
     </w:p>
     <w:p>
@@ -9956,15 +10926,7 @@
         <w:spacing w:after="120" w:before="280"/>
       </w:pPr>
       <w:r>
-        <w:rPr>
-          <w:rFonts w:ascii="Arial" w:cs="Arial" w:eastAsia="Arial" w:hAnsi="Arial"/>
-          <w:b/>
-          <w:bCs/>
-          <w:color w:val="0F3460"/>
-          <w:sz w:val="28"/>
-          <w:szCs w:val="28"/>
-        </w:rPr>
-        <w:t xml:space="preserve">8.2 Formats de Distribution</w:t>
+        <w:t>14.2 Formats de Distribution</w:t>
       </w:r>
     </w:p>
     <w:p>
@@ -10330,18 +11292,59 @@
     <w:p>
       <w:pPr>
         <w:pStyle w:val="Heading2"/>
+      </w:pPr>
+      <w:r>
+        <w:t>14.3 Gouvernance et Classification des Données</w:t>
+      </w:r>
+    </w:p>
+    <w:p>
+      <w:r>
+        <w:t>Le traitement de données potentiellement sensibles (bancaires, médicales, électorales) impose un cadre strict de gouvernance des données :</w:t>
+      </w:r>
+    </w:p>
+    <w:p>
+      <w:pPr>
+        <w:pStyle w:val="ListParagraph"/>
+      </w:pPr>
+      <w:r>
+        <w:t>• Classification Niveau 1 — Public : Modèles d'invites IA génériques, signatures CVE publiques, versions génériques d'OS.</w:t>
+      </w:r>
+    </w:p>
+    <w:p>
+      <w:pPr>
+        <w:pStyle w:val="ListParagraph"/>
+      </w:pPr>
+      <w:r>
+        <w:t>• Classification Niveau 2 — Confidentiel : Topologies de réseau local, adresses IP des machines du parc, rapports d'audit techniques générés.</w:t>
+      </w:r>
+    </w:p>
+    <w:p>
+      <w:pPr>
+        <w:pStyle w:val="ListParagraph"/>
+      </w:pPr>
+      <w:r>
+        <w:t>• Classification Niveau 3 — Strictement Confidentiel : Identifiants de connexion interceptés (mots de passe en clair), données médicales ou bancaires capturées lors des analyses de trafic.</w:t>
+      </w:r>
+    </w:p>
+    <w:p>
+      <w:r>
+        <w:t>Séparation des Environnements : Les captures pcaps et les informations de niveau 3 sont stockées en mémoire volatile (tmpfs) et détruites à la fermeture de la session d'audit. Aucun stockage persistant de niveau 3 n'est effectué sans chiffrement fort AES-256 en base SQLite locale. Les environnements de test utilisent des données factices et isolées.</w:t>
+      </w:r>
+    </w:p>
+    <w:p/>
+    <w:p>
+      <w:r>
+        <w:t>Hardening local et durcissement des agents IA : Les agents IA s'exécutent avec des comptes de service dédiés sans privilèges interactifs. Les clés cryptographiques d'accès aux APIs LLM sont chiffrées au repos via la clé de session et ne sont jamais journalisées ou affichées à l'écran. Des audits bi-annuels vérifient l'absence de dérive d'habilitation des agents.</w:t>
+      </w:r>
+    </w:p>
+    <w:p/>
+    <w:p>
+      <w:pPr>
+        <w:pStyle w:val="Heading2"/>
         <w:spacing w:after="120" w:before="280"/>
       </w:pPr>
       <w:r>
-        <w:rPr>
-          <w:rFonts w:ascii="Arial" w:cs="Arial" w:eastAsia="Arial" w:hAnsi="Arial"/>
-          <w:b/>
-          <w:bCs/>
-          <w:color w:val="0F3460"/>
-          <w:sz w:val="28"/>
-          <w:szCs w:val="28"/>
-        </w:rPr>
-        <w:t xml:space="preserve">8.3 Script d'Installation Automatique</w:t>
+        <w:t>14.4 Script d'Installation Automatique</w:t>
       </w:r>
     </w:p>
     <w:p>
@@ -10383,15 +11386,15 @@
         <w:spacing w:after="180" w:before="360"/>
       </w:pPr>
       <w:r>
-        <w:rPr>
-          <w:rFonts w:ascii="Arial" w:cs="Arial" w:eastAsia="Arial" w:hAnsi="Arial"/>
-          <w:b/>
-          <w:bCs/>
-          <w:color w:val="1A1A2E"/>
-          <w:sz w:val="36"/>
-          <w:szCs w:val="36"/>
-        </w:rPr>
-        <w:t xml:space="preserve">9. Planning &amp; Roadmap</w:t>
+        <w:t>15. Roadmap, Recette, SLA &amp; Approbations</w:t>
+      </w:r>
+    </w:p>
+    <w:p>
+      <w:pPr>
+        <w:pStyle w:val="Heading2"/>
+      </w:pPr>
+      <w:r>
+        <w:t>15.1 Planning &amp; Roadmap</w:t>
       </w:r>
     </w:p>
     <w:p>
@@ -10964,22 +11967,204 @@
     </w:p>
     <w:p>
       <w:pPr>
-        <w:pStyle w:val="Heading1"/>
+        <w:pStyle w:val="Heading3"/>
+      </w:pPr>
+      <w:r>
+        <w:t>15.1.1 Feuille de Route Progressive et Paliers de Maturité (Burundi)</w:t>
+      </w:r>
+    </w:p>
+    <w:p>
+      <w:r>
+        <w:t>L'architecture de SOC agentique étant une technologie émergente en cours d'adoption (Technology Trigger du Gartner, 1-5% de pénétration de marché), et face à la pénurie locale d'ingénieurs cyber qualifiés, NetSentinel adopte un déploiement progressif en trois paliers :</w:t>
+      </w:r>
+    </w:p>
+    <w:p>
+      <w:pPr>
+        <w:pStyle w:val="ListParagraph"/>
+      </w:pPr>
+      <w:r>
+        <w:t>• Palier 1 (Mois 1-12) — SOAR Classique &amp; IA Assistée : L'IA agit exclusivement comme assistant (génération de rapports, copilote explicatif). Toute action réseau ou système doit être manuellement déclenchée par l'analyste.</w:t>
+      </w:r>
+    </w:p>
+    <w:p>
+      <w:pPr>
+        <w:pStyle w:val="ListParagraph"/>
+      </w:pPr>
+      <w:r>
+        <w:t>• Palier 2 (Mois 13-24) — Automatisation Supervisée : Automatisation des alertes de faible criticité (ex. blocage iptables d'IP scannant agressivement, flush ARP) validée formellement par le moteur PDDL. Les incidents complexes requièrent toujours l'approbation humaine.</w:t>
+      </w:r>
+    </w:p>
+    <w:p>
+      <w:pPr>
+        <w:pStyle w:val="ListParagraph"/>
+      </w:pPr>
+      <w:r>
+        <w:t>• Palier 3 (Mois 25-36) — Autonomie Agentique Encadrée : Activation de l'autonomie des agents IA pour le triage et l'investigation active, sous le contrôle formel des garde-fous PDDL et après montée en compétences des équipes locales.</w:t>
+      </w:r>
+    </w:p>
+    <w:p>
+      <w:pPr>
+        <w:pStyle w:val="ListParagraph"/>
+      </w:pPr>
+      <w:r>
+        <w:t>• Modèle d'Appui Hybride (MSSP) : Pour sécuriser la phase transitoire de montée en compétences (Paliers 1 et 2), NetSentinel prévoit des passerelles d'intégration sécurisées permettant à un centre MSSP (Managed Security Service Provider) partenaire externe d'appuyer les équipes souveraines locales pour la validation d'incidents complexes de niveau 3.</w:t>
+      </w:r>
+    </w:p>
+    <w:p/>
+    <w:p>
+      <w:pPr>
+        <w:pStyle w:val="Heading2"/>
+      </w:pPr>
+      <w:r>
+        <w:t>15.2 Critères d'Acceptation &amp; Plan de Recette (UAT)</w:t>
+      </w:r>
+    </w:p>
+    <w:p>
+      <w:r>
+        <w:t>La recette utilisateur (User Acceptance Testing) est articulée autour des critères de validation suivants :</w:t>
+      </w:r>
+    </w:p>
+    <w:p>
+      <w:pPr>
+        <w:pStyle w:val="ListParagraph"/>
+      </w:pPr>
+      <w:r>
+        <w:t>• Détection : L'application doit identifier au moins 98% des hôtes actifs sur un segment LAN (/24) en moins de 30 secondes.</w:t>
+      </w:r>
+    </w:p>
+    <w:p>
+      <w:pPr>
+        <w:pStyle w:val="ListParagraph"/>
+      </w:pPr>
+      <w:r>
+        <w:t>• Fiabilité : 100% des mots de passe transmis en clair (HTTP Basic, FTP) sur le réseau testé doivent être interceptés et affichés sans faux négatif.</w:t>
+      </w:r>
+    </w:p>
+    <w:p>
+      <w:pPr>
+        <w:pStyle w:val="ListParagraph"/>
+      </w:pPr>
+      <w:r>
+        <w:t>• Convivialité : Zéro ligne de commande CLI requise pour exécuter un cycle complet d'audit (Découverte -&gt; Fingerprint -&gt; Analyse -&gt; Proxy).</w:t>
+      </w:r>
+    </w:p>
+    <w:p>
+      <w:pPr>
+        <w:pStyle w:val="ListParagraph"/>
+      </w:pPr>
+      <w:r>
+        <w:t>• Rapports : Les rapports PDF et DOCX générés doivent être complets, structurés et correspondre aux gabarits officiels de l'organisation.</w:t>
+      </w:r>
+    </w:p>
+    <w:p>
+      <w:pPr>
+        <w:pStyle w:val="Heading2"/>
+      </w:pPr>
+      <w:r>
+        <w:t>15.3 Plan de Test et de Validation</w:t>
+      </w:r>
+    </w:p>
+    <w:p>
+      <w:r>
+        <w:t>Avant chaque mise en production, le pipeline DevSecOps de NetSentinel exécute automatiquement :</w:t>
+      </w:r>
+    </w:p>
+    <w:p>
+      <w:pPr>
+        <w:pStyle w:val="ListParagraph"/>
+      </w:pPr>
+      <w:r>
+        <w:t>• Tests Unitaires (Vitest) : Couverture minimale requise de 80% du code source backend et frontend.</w:t>
+      </w:r>
+    </w:p>
+    <w:p>
+      <w:pPr>
+        <w:pStyle w:val="ListParagraph"/>
+      </w:pPr>
+      <w:r>
+        <w:t>• Tests End-to-End (Playwright) : Scénarios complets simulant des scans de ports et des captures de paquets réseau dans des conteneurs isolés.</w:t>
+      </w:r>
+    </w:p>
+    <w:p>
+      <w:pPr>
+        <w:pStyle w:val="ListParagraph"/>
+      </w:pPr>
+      <w:r>
+        <w:t>• Audit de Sécurité Automatique : Analyse statique de code (SAST via SonarQube) et vérification d'absence de vulnérabilités dans les dépendances NPM (npm audit).</w:t>
+      </w:r>
+    </w:p>
+    <w:p>
+      <w:pPr>
+        <w:pStyle w:val="Heading2"/>
+      </w:pPr>
+      <w:r>
+        <w:t>15.4 Plan de Maintenance et SLA (Service Level Agreement)</w:t>
+      </w:r>
+    </w:p>
+    <w:p>
+      <w:r>
+        <w:t>La maintenance post-déploiement est structurée selon deux niveaux de support :</w:t>
+      </w:r>
+    </w:p>
+    <w:p>
+      <w:pPr>
+        <w:pStyle w:val="ListParagraph"/>
+      </w:pPr>
+      <w:r>
+        <w:t>• Support Correctif Critique (SLA Niveau 1) : Correction de tout bug bloquant (ex. plantage du service de capture tshark) ou de faille de sécurité sous 24 heures.</w:t>
+      </w:r>
+    </w:p>
+    <w:p>
+      <w:pPr>
+        <w:pStyle w:val="ListParagraph"/>
+      </w:pPr>
+      <w:r>
+        <w:t>• Support Évolutif (SLA Niveau 2) : Prise en charge des mises à jour système (compatibilité avec de nouvelles versions d'Ubuntu, nmap ou mitmproxy) sous 7 jours ouvrés.</w:t>
+      </w:r>
+    </w:p>
+    <w:p>
+      <w:pPr>
+        <w:pStyle w:val="ListParagraph"/>
+      </w:pPr>
+      <w:r>
+        <w:t>• Support local assuré par l'équipe technique nationale à Bujumbura.</w:t>
+      </w:r>
+    </w:p>
+    <w:p>
+      <w:pPr>
+        <w:pStyle w:val="Heading2"/>
+      </w:pPr>
+      <w:r>
+        <w:t>15.5 Modalités Contractuelles</w:t>
+      </w:r>
+    </w:p>
+    <w:p>
+      <w:pPr>
+        <w:pStyle w:val="ListParagraph"/>
+      </w:pPr>
+      <w:r>
+        <w:t>• Propriété Intellectuelle : L'ensemble du code source, des livrables et de la documentation associée reste la propriété exclusive et souveraine de l'État burundais sous licence fermée.</w:t>
+      </w:r>
+    </w:p>
+    <w:p>
+      <w:pPr>
+        <w:pStyle w:val="ListParagraph"/>
+      </w:pPr>
+      <w:r>
+        <w:t>• Pénalités de Retard : En cas de retard de livraison sur un jalon critique de la roadmap (Réf. Section 15.1), des pénalités forfaitaires de 0,5% du montant de la phase par semaine de retard seront appliquées.</w:t>
+      </w:r>
+    </w:p>
+    <w:p/>
+    <w:p>
+      <w:pPr>
+        <w:pStyle w:val="Heading2"/>
         <w:pBdr>
           <w:bottom w:val="single" w:color="E94560" w:sz="8" w:space="6"/>
         </w:pBdr>
         <w:spacing w:after="180" w:before="360"/>
       </w:pPr>
       <w:r>
-        <w:rPr>
-          <w:rFonts w:ascii="Arial" w:cs="Arial" w:eastAsia="Arial" w:hAnsi="Arial"/>
-          <w:b/>
-          <w:bCs/>
-          <w:color w:val="1A1A2E"/>
-          <w:sz w:val="36"/>
-          <w:szCs w:val="36"/>
-        </w:rPr>
-        <w:t xml:space="preserve">10. Risques &amp; Mitigations</w:t>
+        <w:t>15.6 Risques &amp; Mitigations</w:t>
       </w:r>
     </w:p>
     <w:p>
@@ -11291,15 +12476,7 @@
           </w:tcPr>
           <w:p>
             <w:r>
-              <w:rPr>
-                <w:rFonts w:ascii="Arial" w:cs="Arial" w:eastAsia="Arial" w:hAnsi="Arial"/>
-                <w:b/>
-                <w:bCs/>
-                <w:color w:val="0F3460"/>
-                <w:sz w:val="22"/>
-                <w:szCs w:val="22"/>
-              </w:rPr>
-              <w:t xml:space="preserve">API Claude rate limiting</w:t>
+              <w:t>API Gemini rate limiting</w:t>
             </w:r>
           </w:p>
         </w:tc>
@@ -11547,22 +12724,14 @@
     </w:p>
     <w:p>
       <w:pPr>
-        <w:pStyle w:val="Heading1"/>
+        <w:pStyle w:val="Heading2"/>
         <w:pBdr>
           <w:bottom w:val="single" w:color="E94560" w:sz="8" w:space="6"/>
         </w:pBdr>
         <w:spacing w:after="180" w:before="360"/>
       </w:pPr>
       <w:r>
-        <w:rPr>
-          <w:rFonts w:ascii="Arial" w:cs="Arial" w:eastAsia="Arial" w:hAnsi="Arial"/>
-          <w:b/>
-          <w:bCs/>
-          <w:color w:val="1A1A2E"/>
-          <w:sz w:val="36"/>
-          <w:szCs w:val="36"/>
-        </w:rPr>
-        <w:t xml:space="preserve">11. Glossaire</w:t>
+        <w:t>15.7 Glossaire</w:t>
       </w:r>
     </w:p>
     <w:p>
@@ -13799,15 +14968,7 @@
           </w:tcPr>
           <w:p>
             <w:r>
-              <w:rPr>
-                <w:rFonts w:ascii="Arial" w:cs="Arial" w:eastAsia="Arial" w:hAnsi="Arial"/>
-                <w:b/>
-                <w:bCs/>
-                <w:color w:val="0F3460"/>
-                <w:sz w:val="22"/>
-                <w:szCs w:val="22"/>
-              </w:rPr>
-              <w:t xml:space="preserve">@anthropic-ai/sdk</w:t>
+              <w:t>@google/generative-ai</w:t>
             </w:r>
           </w:p>
         </w:tc>
@@ -13861,13 +15022,7 @@
           </w:tcPr>
           <w:p>
             <w:r>
-              <w:rPr>
-                <w:rFonts w:ascii="Arial" w:cs="Arial" w:eastAsia="Arial" w:hAnsi="Arial"/>
-                <w:color w:val="1F2937"/>
-                <w:sz w:val="22"/>
-                <w:szCs w:val="22"/>
-              </w:rPr>
-              <w:t xml:space="preserve">Client API Claude</w:t>
+              <w:t>Client API Gemini</w:t>
             </w:r>
           </w:p>
         </w:tc>
@@ -14037,13 +15192,7 @@
         <w:ind w:left="720" w:hanging="360"/>
       </w:pPr>
       <w:r>
-        <w:rPr>
-          <w:rFonts w:ascii="Arial" w:cs="Arial" w:eastAsia="Arial" w:hAnsi="Arial"/>
-          <w:color w:val="1F2937"/>
-          <w:sz w:val="22"/>
-          <w:szCs w:val="22"/>
-        </w:rPr>
-        <w:t xml:space="preserve">Anthropic API Docs : https://docs.anthropic.com/</w:t>
+        <w:t>Google Gemini API Docs : https://ai.google.dev/</w:t>
       </w:r>
     </w:p>
     <w:p>
@@ -14082,6 +15231,19 @@
     </w:p>
     <w:p>
       <w:pPr>
+        <w:pStyle w:val="Heading2"/>
+      </w:pPr>
+      <w:r>
+        <w:t>15.8 Page de Validation et Signatures</w:t>
+      </w:r>
+    </w:p>
+    <w:p>
+      <w:r>
+        <w:t>Ce cahier des charges technique est validé et approuvé par les parties prenantes ci-dessous :</w:t>
+      </w:r>
+    </w:p>
+    <w:p>
+      <w:pPr>
         <w:spacing w:after="0" w:before="0"/>
         <w:jc w:val="center"/>
       </w:pPr>
@@ -14095,6 +15257,182 @@
         <w:t xml:space="preserve">Document généré pour usage éducatif — Cybersécurité × Intelligence Artificielle</w:t>
       </w:r>
     </w:p>
+    <w:tbl>
+      <w:tblPr>
+        <w:tblW w:type="auto" w:w="0"/>
+        <w:tblLook w:firstColumn="1" w:firstRow="1" w:lastColumn="0" w:lastRow="0" w:noHBand="0" w:noVBand="1" w:val="04A0"/>
+        <w:tblBorders>
+          <w:top w:val="single" w:sz="4" w:space="0" w:color="auto"/>
+          <w:left w:val="single" w:sz="4" w:space="0" w:color="auto"/>
+          <w:bottom w:val="single" w:sz="4" w:space="0" w:color="auto"/>
+          <w:right w:val="single" w:sz="4" w:space="0" w:color="auto"/>
+          <w:insideH w:val="single" w:sz="4" w:space="0" w:color="auto"/>
+          <w:insideV w:val="single" w:sz="4" w:space="0" w:color="auto"/>
+        </w:tblBorders>
+      </w:tblPr>
+      <w:tblGrid>
+        <w:gridCol w:w="2409"/>
+        <w:gridCol w:w="2409"/>
+        <w:gridCol w:w="2409"/>
+        <w:gridCol w:w="2409"/>
+      </w:tblGrid>
+      <w:tr>
+        <w:tc>
+          <w:tcPr>
+            <w:tcW w:type="dxa" w:w="2409"/>
+          </w:tcPr>
+          <w:p>
+            <w:r>
+              <w:t>Rôle</w:t>
+            </w:r>
+          </w:p>
+        </w:tc>
+        <w:tc>
+          <w:tcPr>
+            <w:tcW w:type="dxa" w:w="2409"/>
+          </w:tcPr>
+          <w:p>
+            <w:r>
+              <w:t>Nom &amp; Titre</w:t>
+            </w:r>
+          </w:p>
+        </w:tc>
+        <w:tc>
+          <w:tcPr>
+            <w:tcW w:type="dxa" w:w="2409"/>
+          </w:tcPr>
+          <w:p>
+            <w:r>
+              <w:t>Signature</w:t>
+            </w:r>
+          </w:p>
+        </w:tc>
+        <w:tc>
+          <w:tcPr>
+            <w:tcW w:type="dxa" w:w="2409"/>
+          </w:tcPr>
+          <w:p>
+            <w:r>
+              <w:t>Date</w:t>
+            </w:r>
+          </w:p>
+        </w:tc>
+      </w:tr>
+      <w:tr>
+        <w:tc>
+          <w:tcPr>
+            <w:tcW w:type="dxa" w:w="2409"/>
+          </w:tcPr>
+          <w:p>
+            <w:r>
+              <w:t>Commanditaire / Sponsor</w:t>
+            </w:r>
+          </w:p>
+        </w:tc>
+        <w:tc>
+          <w:tcPr>
+            <w:tcW w:type="dxa" w:w="2409"/>
+          </w:tcPr>
+          <w:p>
+            <w:r>
+              <w:t>Représentant du Ministère des Postes et des TIC</w:t>
+            </w:r>
+          </w:p>
+        </w:tc>
+        <w:tc>
+          <w:tcPr>
+            <w:tcW w:type="dxa" w:w="2409"/>
+          </w:tcPr>
+          <w:p>
+            <w:r/>
+          </w:p>
+        </w:tc>
+        <w:tc>
+          <w:tcPr>
+            <w:tcW w:type="dxa" w:w="2409"/>
+          </w:tcPr>
+          <w:p>
+            <w:r/>
+          </w:p>
+        </w:tc>
+      </w:tr>
+      <w:tr>
+        <w:tc>
+          <w:tcPr>
+            <w:tcW w:type="dxa" w:w="2409"/>
+          </w:tcPr>
+          <w:p>
+            <w:r>
+              <w:t>Directeur de la SI</w:t>
+            </w:r>
+          </w:p>
+        </w:tc>
+        <w:tc>
+          <w:tcPr>
+            <w:tcW w:type="dxa" w:w="2409"/>
+          </w:tcPr>
+          <w:p>
+            <w:r>
+              <w:t>Directeur National de la Sécurité des Systèmes d'Information</w:t>
+            </w:r>
+          </w:p>
+        </w:tc>
+        <w:tc>
+          <w:tcPr>
+            <w:tcW w:type="dxa" w:w="2409"/>
+          </w:tcPr>
+          <w:p>
+            <w:r/>
+          </w:p>
+        </w:tc>
+        <w:tc>
+          <w:tcPr>
+            <w:tcW w:type="dxa" w:w="2409"/>
+          </w:tcPr>
+          <w:p>
+            <w:r/>
+          </w:p>
+        </w:tc>
+      </w:tr>
+      <w:tr>
+        <w:tc>
+          <w:tcPr>
+            <w:tcW w:type="dxa" w:w="2409"/>
+          </w:tcPr>
+          <w:p>
+            <w:r>
+              <w:t>Architecte Technique</w:t>
+            </w:r>
+          </w:p>
+        </w:tc>
+        <w:tc>
+          <w:tcPr>
+            <w:tcW w:type="dxa" w:w="2409"/>
+          </w:tcPr>
+          <w:p>
+            <w:r>
+              <w:t>Lead Architect NetSentinel</w:t>
+            </w:r>
+          </w:p>
+        </w:tc>
+        <w:tc>
+          <w:tcPr>
+            <w:tcW w:type="dxa" w:w="2409"/>
+          </w:tcPr>
+          <w:p>
+            <w:r/>
+          </w:p>
+        </w:tc>
+        <w:tc>
+          <w:tcPr>
+            <w:tcW w:type="dxa" w:w="2409"/>
+          </w:tcPr>
+          <w:p>
+            <w:r/>
+          </w:p>
+        </w:tc>
+      </w:tr>
+    </w:tbl>
     <w:sectPr>
       <w:headerReference w:type="default" r:id="rId7"/>
       <w:footerReference w:type="default" r:id="rId8"/>

</xml_diff>